<commit_message>
current_state: emotion direct audio route diff
Blockbuster in-domain best direct is majority voting (0.621), not 0.593

Co-Authored-By: Claude Opus 5.5 <noreply@anthropic.com>
</commit_message>
<xml_diff>
--- a/docs/current_state.docx
+++ b/docs/current_state.docx
@@ -1037,7 +1037,7 @@
     </w:p>
     <w:p>
       <w:r>
-        <w:t>Bold is the best of the four audio routes (emotion, VGGish, AST, PCA-8).</w:t>
+        <w:t>Bold is the best of the four audio routes (emotion, VGGish, AST, PCA-8). The last column is the emotion route minus the better of the two direct audio routes (VGGish or AST, named in brackets) under that metric; a positive value means the emotion route is ahead, except for Hamming loss, where lower is better. It is the difference of the two means, so it can differ by up to 0.002 from the bootstrap difference in the next table.</w:t>
       </w:r>
     </w:p>
     <w:tbl>
@@ -1048,20 +1048,21 @@
         <w:tblLook w:firstColumn="1" w:firstRow="1" w:lastColumn="0" w:lastRow="0" w:noHBand="0" w:noVBand="1" w:val="04A0"/>
       </w:tblPr>
       <w:tblGrid>
-        <w:gridCol w:w="1108"/>
-        <w:gridCol w:w="1108"/>
-        <w:gridCol w:w="1108"/>
-        <w:gridCol w:w="1108"/>
-        <w:gridCol w:w="1108"/>
-        <w:gridCol w:w="1108"/>
-        <w:gridCol w:w="1108"/>
-        <w:gridCol w:w="1108"/>
-        <w:gridCol w:w="1108"/>
+        <w:gridCol w:w="997"/>
+        <w:gridCol w:w="997"/>
+        <w:gridCol w:w="997"/>
+        <w:gridCol w:w="997"/>
+        <w:gridCol w:w="997"/>
+        <w:gridCol w:w="997"/>
+        <w:gridCol w:w="997"/>
+        <w:gridCol w:w="997"/>
+        <w:gridCol w:w="997"/>
+        <w:gridCol w:w="997"/>
       </w:tblGrid>
       <w:tr>
         <w:tc>
           <w:tcPr>
-            <w:tcW w:type="dxa" w:w="1108"/>
+            <w:tcW w:type="dxa" w:w="997"/>
             <w:shd w:val="clear" w:color="auto" w:fill="E8E8E8"/>
           </w:tcPr>
           <w:p>
@@ -1079,7 +1080,7 @@
         </w:tc>
         <w:tc>
           <w:tcPr>
-            <w:tcW w:type="dxa" w:w="1108"/>
+            <w:tcW w:type="dxa" w:w="997"/>
             <w:shd w:val="clear" w:color="auto" w:fill="E8E8E8"/>
           </w:tcPr>
           <w:p>
@@ -1097,7 +1098,7 @@
         </w:tc>
         <w:tc>
           <w:tcPr>
-            <w:tcW w:type="dxa" w:w="1108"/>
+            <w:tcW w:type="dxa" w:w="997"/>
             <w:shd w:val="clear" w:color="auto" w:fill="E8E8E8"/>
           </w:tcPr>
           <w:p>
@@ -1115,7 +1116,7 @@
         </w:tc>
         <w:tc>
           <w:tcPr>
-            <w:tcW w:type="dxa" w:w="1108"/>
+            <w:tcW w:type="dxa" w:w="997"/>
             <w:shd w:val="clear" w:color="auto" w:fill="E8E8E8"/>
           </w:tcPr>
           <w:p>
@@ -1133,7 +1134,7 @@
         </w:tc>
         <w:tc>
           <w:tcPr>
-            <w:tcW w:type="dxa" w:w="1108"/>
+            <w:tcW w:type="dxa" w:w="997"/>
             <w:shd w:val="clear" w:color="auto" w:fill="E8E8E8"/>
           </w:tcPr>
           <w:p>
@@ -1151,7 +1152,7 @@
         </w:tc>
         <w:tc>
           <w:tcPr>
-            <w:tcW w:type="dxa" w:w="1108"/>
+            <w:tcW w:type="dxa" w:w="997"/>
             <w:shd w:val="clear" w:color="auto" w:fill="E8E8E8"/>
           </w:tcPr>
           <w:p>
@@ -1169,7 +1170,7 @@
         </w:tc>
         <w:tc>
           <w:tcPr>
-            <w:tcW w:type="dxa" w:w="1108"/>
+            <w:tcW w:type="dxa" w:w="997"/>
             <w:shd w:val="clear" w:color="auto" w:fill="E8E8E8"/>
           </w:tcPr>
           <w:p>
@@ -1187,7 +1188,7 @@
         </w:tc>
         <w:tc>
           <w:tcPr>
-            <w:tcW w:type="dxa" w:w="1108"/>
+            <w:tcW w:type="dxa" w:w="997"/>
             <w:shd w:val="clear" w:color="auto" w:fill="E8E8E8"/>
           </w:tcPr>
           <w:p>
@@ -1205,7 +1206,7 @@
         </w:tc>
         <w:tc>
           <w:tcPr>
-            <w:tcW w:type="dxa" w:w="1108"/>
+            <w:tcW w:type="dxa" w:w="997"/>
             <w:shd w:val="clear" w:color="auto" w:fill="E8E8E8"/>
           </w:tcPr>
           <w:p>
@@ -1218,6 +1219,24 @@
                 <w:sz w:val="17"/>
               </w:rPr>
               <w:t>random</w:t>
+            </w:r>
+          </w:p>
+        </w:tc>
+        <w:tc>
+          <w:tcPr>
+            <w:tcW w:type="dxa" w:w="997"/>
+            <w:shd w:val="clear" w:color="auto" w:fill="E8E8E8"/>
+          </w:tcPr>
+          <w:p>
+            <w:pPr>
+              <w:spacing w:after="0"/>
+            </w:pPr>
+            <w:r>
+              <w:rPr>
+                <w:b/>
+                <w:sz w:val="17"/>
+              </w:rPr>
+              <w:t>Δ emotion − best direct</w:t>
             </w:r>
           </w:p>
         </w:tc>
@@ -1225,7 +1244,7 @@
       <w:tr>
         <w:tc>
           <w:tcPr>
-            <w:tcW w:type="dxa" w:w="1108"/>
+            <w:tcW w:type="dxa" w:w="997"/>
           </w:tcPr>
           <w:p>
             <w:pPr>
@@ -1241,7 +1260,7 @@
         </w:tc>
         <w:tc>
           <w:tcPr>
-            <w:tcW w:type="dxa" w:w="1108"/>
+            <w:tcW w:type="dxa" w:w="997"/>
           </w:tcPr>
           <w:p>
             <w:pPr>
@@ -1258,7 +1277,7 @@
         </w:tc>
         <w:tc>
           <w:tcPr>
-            <w:tcW w:type="dxa" w:w="1108"/>
+            <w:tcW w:type="dxa" w:w="997"/>
           </w:tcPr>
           <w:p>
             <w:pPr>
@@ -1275,7 +1294,7 @@
         </w:tc>
         <w:tc>
           <w:tcPr>
-            <w:tcW w:type="dxa" w:w="1108"/>
+            <w:tcW w:type="dxa" w:w="997"/>
           </w:tcPr>
           <w:p>
             <w:pPr>
@@ -1293,7 +1312,7 @@
         </w:tc>
         <w:tc>
           <w:tcPr>
-            <w:tcW w:type="dxa" w:w="1108"/>
+            <w:tcW w:type="dxa" w:w="997"/>
           </w:tcPr>
           <w:p>
             <w:pPr>
@@ -1310,7 +1329,7 @@
         </w:tc>
         <w:tc>
           <w:tcPr>
-            <w:tcW w:type="dxa" w:w="1108"/>
+            <w:tcW w:type="dxa" w:w="997"/>
           </w:tcPr>
           <w:p>
             <w:pPr>
@@ -1327,7 +1346,7 @@
         </w:tc>
         <w:tc>
           <w:tcPr>
-            <w:tcW w:type="dxa" w:w="1108"/>
+            <w:tcW w:type="dxa" w:w="997"/>
           </w:tcPr>
           <w:p>
             <w:pPr>
@@ -1344,7 +1363,7 @@
         </w:tc>
         <w:tc>
           <w:tcPr>
-            <w:tcW w:type="dxa" w:w="1108"/>
+            <w:tcW w:type="dxa" w:w="997"/>
           </w:tcPr>
           <w:p>
             <w:pPr>
@@ -1361,7 +1380,7 @@
         </w:tc>
         <w:tc>
           <w:tcPr>
-            <w:tcW w:type="dxa" w:w="1108"/>
+            <w:tcW w:type="dxa" w:w="997"/>
           </w:tcPr>
           <w:p>
             <w:pPr>
@@ -1373,6 +1392,30 @@
                 <w:sz w:val="17"/>
               </w:rPr>
               <w:t>0.308</w:t>
+            </w:r>
+          </w:p>
+        </w:tc>
+        <w:tc>
+          <w:tcPr>
+            <w:tcW w:type="dxa" w:w="997"/>
+          </w:tcPr>
+          <w:p>
+            <w:pPr>
+              <w:spacing w:after="0"/>
+              <w:jc w:val="right"/>
+            </w:pPr>
+            <w:r>
+              <w:rPr>
+                <w:b/>
+                <w:sz w:val="17"/>
+              </w:rPr>
+              <w:t>+0.040</w:t>
+            </w:r>
+            <w:r>
+              <w:rPr>
+                <w:sz w:val="17"/>
+              </w:rPr>
+              <w:t xml:space="preserve"> (VGGish)</w:t>
             </w:r>
           </w:p>
         </w:tc>
@@ -1380,7 +1423,7 @@
       <w:tr>
         <w:tc>
           <w:tcPr>
-            <w:tcW w:type="dxa" w:w="1108"/>
+            <w:tcW w:type="dxa" w:w="997"/>
           </w:tcPr>
           <w:p>
             <w:pPr>
@@ -1396,7 +1439,7 @@
         </w:tc>
         <w:tc>
           <w:tcPr>
-            <w:tcW w:type="dxa" w:w="1108"/>
+            <w:tcW w:type="dxa" w:w="997"/>
           </w:tcPr>
           <w:p>
             <w:pPr>
@@ -1412,7 +1455,7 @@
         </w:tc>
         <w:tc>
           <w:tcPr>
-            <w:tcW w:type="dxa" w:w="1108"/>
+            <w:tcW w:type="dxa" w:w="997"/>
           </w:tcPr>
           <w:p>
             <w:pPr>
@@ -1429,7 +1472,7 @@
         </w:tc>
         <w:tc>
           <w:tcPr>
-            <w:tcW w:type="dxa" w:w="1108"/>
+            <w:tcW w:type="dxa" w:w="997"/>
           </w:tcPr>
           <w:p>
             <w:pPr>
@@ -1446,7 +1489,7 @@
         </w:tc>
         <w:tc>
           <w:tcPr>
-            <w:tcW w:type="dxa" w:w="1108"/>
+            <w:tcW w:type="dxa" w:w="997"/>
           </w:tcPr>
           <w:p>
             <w:pPr>
@@ -1463,7 +1506,7 @@
         </w:tc>
         <w:tc>
           <w:tcPr>
-            <w:tcW w:type="dxa" w:w="1108"/>
+            <w:tcW w:type="dxa" w:w="997"/>
           </w:tcPr>
           <w:p>
             <w:pPr>
@@ -1481,7 +1524,7 @@
         </w:tc>
         <w:tc>
           <w:tcPr>
-            <w:tcW w:type="dxa" w:w="1108"/>
+            <w:tcW w:type="dxa" w:w="997"/>
           </w:tcPr>
           <w:p>
             <w:pPr>
@@ -1498,7 +1541,7 @@
         </w:tc>
         <w:tc>
           <w:tcPr>
-            <w:tcW w:type="dxa" w:w="1108"/>
+            <w:tcW w:type="dxa" w:w="997"/>
           </w:tcPr>
           <w:p>
             <w:pPr>
@@ -1515,7 +1558,7 @@
         </w:tc>
         <w:tc>
           <w:tcPr>
-            <w:tcW w:type="dxa" w:w="1108"/>
+            <w:tcW w:type="dxa" w:w="997"/>
           </w:tcPr>
           <w:p>
             <w:pPr>
@@ -1527,6 +1570,23 @@
                 <w:sz w:val="17"/>
               </w:rPr>
               <w:t>0.477</w:t>
+            </w:r>
+          </w:p>
+        </w:tc>
+        <w:tc>
+          <w:tcPr>
+            <w:tcW w:type="dxa" w:w="997"/>
+          </w:tcPr>
+          <w:p>
+            <w:pPr>
+              <w:spacing w:after="0"/>
+              <w:jc w:val="right"/>
+            </w:pPr>
+            <w:r>
+              <w:rPr>
+                <w:sz w:val="17"/>
+              </w:rPr>
+              <w:t>−0.033 (AST)</w:t>
             </w:r>
           </w:p>
         </w:tc>
@@ -1534,7 +1594,7 @@
       <w:tr>
         <w:tc>
           <w:tcPr>
-            <w:tcW w:type="dxa" w:w="1108"/>
+            <w:tcW w:type="dxa" w:w="997"/>
           </w:tcPr>
           <w:p>
             <w:pPr>
@@ -1550,7 +1610,7 @@
         </w:tc>
         <w:tc>
           <w:tcPr>
-            <w:tcW w:type="dxa" w:w="1108"/>
+            <w:tcW w:type="dxa" w:w="997"/>
           </w:tcPr>
           <w:p>
             <w:pPr>
@@ -1566,7 +1626,7 @@
         </w:tc>
         <w:tc>
           <w:tcPr>
-            <w:tcW w:type="dxa" w:w="1108"/>
+            <w:tcW w:type="dxa" w:w="997"/>
           </w:tcPr>
           <w:p>
             <w:pPr>
@@ -1583,7 +1643,7 @@
         </w:tc>
         <w:tc>
           <w:tcPr>
-            <w:tcW w:type="dxa" w:w="1108"/>
+            <w:tcW w:type="dxa" w:w="997"/>
           </w:tcPr>
           <w:p>
             <w:pPr>
@@ -1601,7 +1661,7 @@
         </w:tc>
         <w:tc>
           <w:tcPr>
-            <w:tcW w:type="dxa" w:w="1108"/>
+            <w:tcW w:type="dxa" w:w="997"/>
           </w:tcPr>
           <w:p>
             <w:pPr>
@@ -1618,7 +1678,7 @@
         </w:tc>
         <w:tc>
           <w:tcPr>
-            <w:tcW w:type="dxa" w:w="1108"/>
+            <w:tcW w:type="dxa" w:w="997"/>
           </w:tcPr>
           <w:p>
             <w:pPr>
@@ -1635,7 +1695,7 @@
         </w:tc>
         <w:tc>
           <w:tcPr>
-            <w:tcW w:type="dxa" w:w="1108"/>
+            <w:tcW w:type="dxa" w:w="997"/>
           </w:tcPr>
           <w:p>
             <w:pPr>
@@ -1652,7 +1712,7 @@
         </w:tc>
         <w:tc>
           <w:tcPr>
-            <w:tcW w:type="dxa" w:w="1108"/>
+            <w:tcW w:type="dxa" w:w="997"/>
           </w:tcPr>
           <w:p>
             <w:pPr>
@@ -1669,7 +1729,7 @@
         </w:tc>
         <w:tc>
           <w:tcPr>
-            <w:tcW w:type="dxa" w:w="1108"/>
+            <w:tcW w:type="dxa" w:w="997"/>
           </w:tcPr>
           <w:p>
             <w:pPr>
@@ -1681,6 +1741,23 @@
                 <w:sz w:val="17"/>
               </w:rPr>
               <w:t>0.477</w:t>
+            </w:r>
+          </w:p>
+        </w:tc>
+        <w:tc>
+          <w:tcPr>
+            <w:tcW w:type="dxa" w:w="997"/>
+          </w:tcPr>
+          <w:p>
+            <w:pPr>
+              <w:spacing w:after="0"/>
+              <w:jc w:val="right"/>
+            </w:pPr>
+            <w:r>
+              <w:rPr>
+                <w:sz w:val="17"/>
+              </w:rPr>
+              <w:t>+0.016 (AST)</w:t>
             </w:r>
           </w:p>
         </w:tc>
@@ -1688,7 +1765,7 @@
       <w:tr>
         <w:tc>
           <w:tcPr>
-            <w:tcW w:type="dxa" w:w="1108"/>
+            <w:tcW w:type="dxa" w:w="997"/>
           </w:tcPr>
           <w:p>
             <w:pPr>
@@ -1704,7 +1781,7 @@
         </w:tc>
         <w:tc>
           <w:tcPr>
-            <w:tcW w:type="dxa" w:w="1108"/>
+            <w:tcW w:type="dxa" w:w="997"/>
           </w:tcPr>
           <w:p>
             <w:pPr>
@@ -1720,7 +1797,7 @@
         </w:tc>
         <w:tc>
           <w:tcPr>
-            <w:tcW w:type="dxa" w:w="1108"/>
+            <w:tcW w:type="dxa" w:w="997"/>
           </w:tcPr>
           <w:p>
             <w:pPr>
@@ -1737,7 +1814,7 @@
         </w:tc>
         <w:tc>
           <w:tcPr>
-            <w:tcW w:type="dxa" w:w="1108"/>
+            <w:tcW w:type="dxa" w:w="997"/>
           </w:tcPr>
           <w:p>
             <w:pPr>
@@ -1754,7 +1831,7 @@
         </w:tc>
         <w:tc>
           <w:tcPr>
-            <w:tcW w:type="dxa" w:w="1108"/>
+            <w:tcW w:type="dxa" w:w="997"/>
           </w:tcPr>
           <w:p>
             <w:pPr>
@@ -1771,7 +1848,7 @@
         </w:tc>
         <w:tc>
           <w:tcPr>
-            <w:tcW w:type="dxa" w:w="1108"/>
+            <w:tcW w:type="dxa" w:w="997"/>
           </w:tcPr>
           <w:p>
             <w:pPr>
@@ -1789,7 +1866,7 @@
         </w:tc>
         <w:tc>
           <w:tcPr>
-            <w:tcW w:type="dxa" w:w="1108"/>
+            <w:tcW w:type="dxa" w:w="997"/>
           </w:tcPr>
           <w:p>
             <w:pPr>
@@ -1806,7 +1883,7 @@
         </w:tc>
         <w:tc>
           <w:tcPr>
-            <w:tcW w:type="dxa" w:w="1108"/>
+            <w:tcW w:type="dxa" w:w="997"/>
           </w:tcPr>
           <w:p>
             <w:pPr>
@@ -1823,7 +1900,7 @@
         </w:tc>
         <w:tc>
           <w:tcPr>
-            <w:tcW w:type="dxa" w:w="1108"/>
+            <w:tcW w:type="dxa" w:w="997"/>
           </w:tcPr>
           <w:p>
             <w:pPr>
@@ -1835,6 +1912,23 @@
                 <w:sz w:val="17"/>
               </w:rPr>
               <w:t>0.438</w:t>
+            </w:r>
+          </w:p>
+        </w:tc>
+        <w:tc>
+          <w:tcPr>
+            <w:tcW w:type="dxa" w:w="997"/>
+          </w:tcPr>
+          <w:p>
+            <w:pPr>
+              <w:spacing w:after="0"/>
+              <w:jc w:val="right"/>
+            </w:pPr>
+            <w:r>
+              <w:rPr>
+                <w:sz w:val="17"/>
+              </w:rPr>
+              <w:t>−0.011 (AST)</w:t>
             </w:r>
           </w:p>
         </w:tc>
@@ -1842,7 +1936,7 @@
       <w:tr>
         <w:tc>
           <w:tcPr>
-            <w:tcW w:type="dxa" w:w="1108"/>
+            <w:tcW w:type="dxa" w:w="997"/>
           </w:tcPr>
           <w:p>
             <w:pPr>
@@ -1858,7 +1952,7 @@
         </w:tc>
         <w:tc>
           <w:tcPr>
-            <w:tcW w:type="dxa" w:w="1108"/>
+            <w:tcW w:type="dxa" w:w="997"/>
           </w:tcPr>
           <w:p>
             <w:pPr>
@@ -1874,7 +1968,7 @@
         </w:tc>
         <w:tc>
           <w:tcPr>
-            <w:tcW w:type="dxa" w:w="1108"/>
+            <w:tcW w:type="dxa" w:w="997"/>
           </w:tcPr>
           <w:p>
             <w:pPr>
@@ -1891,7 +1985,7 @@
         </w:tc>
         <w:tc>
           <w:tcPr>
-            <w:tcW w:type="dxa" w:w="1108"/>
+            <w:tcW w:type="dxa" w:w="997"/>
           </w:tcPr>
           <w:p>
             <w:pPr>
@@ -1908,7 +2002,7 @@
         </w:tc>
         <w:tc>
           <w:tcPr>
-            <w:tcW w:type="dxa" w:w="1108"/>
+            <w:tcW w:type="dxa" w:w="997"/>
           </w:tcPr>
           <w:p>
             <w:pPr>
@@ -1925,7 +2019,7 @@
         </w:tc>
         <w:tc>
           <w:tcPr>
-            <w:tcW w:type="dxa" w:w="1108"/>
+            <w:tcW w:type="dxa" w:w="997"/>
           </w:tcPr>
           <w:p>
             <w:pPr>
@@ -1942,7 +2036,7 @@
         </w:tc>
         <w:tc>
           <w:tcPr>
-            <w:tcW w:type="dxa" w:w="1108"/>
+            <w:tcW w:type="dxa" w:w="997"/>
           </w:tcPr>
           <w:p>
             <w:pPr>
@@ -1960,7 +2054,7 @@
         </w:tc>
         <w:tc>
           <w:tcPr>
-            <w:tcW w:type="dxa" w:w="1108"/>
+            <w:tcW w:type="dxa" w:w="997"/>
           </w:tcPr>
           <w:p>
             <w:pPr>
@@ -1977,7 +2071,7 @@
         </w:tc>
         <w:tc>
           <w:tcPr>
-            <w:tcW w:type="dxa" w:w="1108"/>
+            <w:tcW w:type="dxa" w:w="997"/>
           </w:tcPr>
           <w:p>
             <w:pPr>
@@ -1989,6 +2083,23 @@
                 <w:sz w:val="17"/>
               </w:rPr>
               <w:t>0.308</w:t>
+            </w:r>
+          </w:p>
+        </w:tc>
+        <w:tc>
+          <w:tcPr>
+            <w:tcW w:type="dxa" w:w="997"/>
+          </w:tcPr>
+          <w:p>
+            <w:pPr>
+              <w:spacing w:after="0"/>
+              <w:jc w:val="right"/>
+            </w:pPr>
+            <w:r>
+              <w:rPr>
+                <w:sz w:val="17"/>
+              </w:rPr>
+              <w:t>+0.011 (VGGish)</w:t>
             </w:r>
           </w:p>
         </w:tc>
@@ -1996,7 +2107,7 @@
       <w:tr>
         <w:tc>
           <w:tcPr>
-            <w:tcW w:type="dxa" w:w="1108"/>
+            <w:tcW w:type="dxa" w:w="997"/>
           </w:tcPr>
           <w:p>
             <w:pPr>
@@ -2012,7 +2123,7 @@
         </w:tc>
         <w:tc>
           <w:tcPr>
-            <w:tcW w:type="dxa" w:w="1108"/>
+            <w:tcW w:type="dxa" w:w="997"/>
           </w:tcPr>
           <w:p>
             <w:pPr>
@@ -2028,7 +2139,7 @@
         </w:tc>
         <w:tc>
           <w:tcPr>
-            <w:tcW w:type="dxa" w:w="1108"/>
+            <w:tcW w:type="dxa" w:w="997"/>
           </w:tcPr>
           <w:p>
             <w:pPr>
@@ -2045,7 +2156,7 @@
         </w:tc>
         <w:tc>
           <w:tcPr>
-            <w:tcW w:type="dxa" w:w="1108"/>
+            <w:tcW w:type="dxa" w:w="997"/>
           </w:tcPr>
           <w:p>
             <w:pPr>
@@ -2063,7 +2174,7 @@
         </w:tc>
         <w:tc>
           <w:tcPr>
-            <w:tcW w:type="dxa" w:w="1108"/>
+            <w:tcW w:type="dxa" w:w="997"/>
           </w:tcPr>
           <w:p>
             <w:pPr>
@@ -2080,7 +2191,7 @@
         </w:tc>
         <w:tc>
           <w:tcPr>
-            <w:tcW w:type="dxa" w:w="1108"/>
+            <w:tcW w:type="dxa" w:w="997"/>
           </w:tcPr>
           <w:p>
             <w:pPr>
@@ -2097,7 +2208,7 @@
         </w:tc>
         <w:tc>
           <w:tcPr>
-            <w:tcW w:type="dxa" w:w="1108"/>
+            <w:tcW w:type="dxa" w:w="997"/>
           </w:tcPr>
           <w:p>
             <w:pPr>
@@ -2114,7 +2225,7 @@
         </w:tc>
         <w:tc>
           <w:tcPr>
-            <w:tcW w:type="dxa" w:w="1108"/>
+            <w:tcW w:type="dxa" w:w="997"/>
           </w:tcPr>
           <w:p>
             <w:pPr>
@@ -2131,7 +2242,7 @@
         </w:tc>
         <w:tc>
           <w:tcPr>
-            <w:tcW w:type="dxa" w:w="1108"/>
+            <w:tcW w:type="dxa" w:w="997"/>
           </w:tcPr>
           <w:p>
             <w:pPr>
@@ -2143,6 +2254,23 @@
                 <w:sz w:val="17"/>
               </w:rPr>
               <w:t>0.321</w:t>
+            </w:r>
+          </w:p>
+        </w:tc>
+        <w:tc>
+          <w:tcPr>
+            <w:tcW w:type="dxa" w:w="997"/>
+          </w:tcPr>
+          <w:p>
+            <w:pPr>
+              <w:spacing w:after="0"/>
+              <w:jc w:val="right"/>
+            </w:pPr>
+            <w:r>
+              <w:rPr>
+                <w:sz w:val="17"/>
+              </w:rPr>
+              <w:t>+0.011 (VGGish)</w:t>
             </w:r>
           </w:p>
         </w:tc>
@@ -2150,7 +2278,7 @@
       <w:tr>
         <w:tc>
           <w:tcPr>
-            <w:tcW w:type="dxa" w:w="1108"/>
+            <w:tcW w:type="dxa" w:w="997"/>
           </w:tcPr>
           <w:p>
             <w:pPr>
@@ -2166,7 +2294,7 @@
         </w:tc>
         <w:tc>
           <w:tcPr>
-            <w:tcW w:type="dxa" w:w="1108"/>
+            <w:tcW w:type="dxa" w:w="997"/>
           </w:tcPr>
           <w:p>
             <w:pPr>
@@ -2182,7 +2310,7 @@
         </w:tc>
         <w:tc>
           <w:tcPr>
-            <w:tcW w:type="dxa" w:w="1108"/>
+            <w:tcW w:type="dxa" w:w="997"/>
           </w:tcPr>
           <w:p>
             <w:pPr>
@@ -2199,7 +2327,7 @@
         </w:tc>
         <w:tc>
           <w:tcPr>
-            <w:tcW w:type="dxa" w:w="1108"/>
+            <w:tcW w:type="dxa" w:w="997"/>
           </w:tcPr>
           <w:p>
             <w:pPr>
@@ -2217,7 +2345,7 @@
         </w:tc>
         <w:tc>
           <w:tcPr>
-            <w:tcW w:type="dxa" w:w="1108"/>
+            <w:tcW w:type="dxa" w:w="997"/>
           </w:tcPr>
           <w:p>
             <w:pPr>
@@ -2234,7 +2362,7 @@
         </w:tc>
         <w:tc>
           <w:tcPr>
-            <w:tcW w:type="dxa" w:w="1108"/>
+            <w:tcW w:type="dxa" w:w="997"/>
           </w:tcPr>
           <w:p>
             <w:pPr>
@@ -2251,7 +2379,7 @@
         </w:tc>
         <w:tc>
           <w:tcPr>
-            <w:tcW w:type="dxa" w:w="1108"/>
+            <w:tcW w:type="dxa" w:w="997"/>
           </w:tcPr>
           <w:p>
             <w:pPr>
@@ -2268,7 +2396,7 @@
         </w:tc>
         <w:tc>
           <w:tcPr>
-            <w:tcW w:type="dxa" w:w="1108"/>
+            <w:tcW w:type="dxa" w:w="997"/>
           </w:tcPr>
           <w:p>
             <w:pPr>
@@ -2285,7 +2413,7 @@
         </w:tc>
         <w:tc>
           <w:tcPr>
-            <w:tcW w:type="dxa" w:w="1108"/>
+            <w:tcW w:type="dxa" w:w="997"/>
           </w:tcPr>
           <w:p>
             <w:pPr>
@@ -2297,6 +2425,23 @@
                 <w:sz w:val="17"/>
               </w:rPr>
               <w:t>0.501</w:t>
+            </w:r>
+          </w:p>
+        </w:tc>
+        <w:tc>
+          <w:tcPr>
+            <w:tcW w:type="dxa" w:w="997"/>
+          </w:tcPr>
+          <w:p>
+            <w:pPr>
+              <w:spacing w:after="0"/>
+              <w:jc w:val="right"/>
+            </w:pPr>
+            <w:r>
+              <w:rPr>
+                <w:sz w:val="17"/>
+              </w:rPr>
+              <w:t>+0.037 (AST)</w:t>
             </w:r>
           </w:p>
         </w:tc>
@@ -2304,7 +2449,7 @@
       <w:tr>
         <w:tc>
           <w:tcPr>
-            <w:tcW w:type="dxa" w:w="1108"/>
+            <w:tcW w:type="dxa" w:w="997"/>
           </w:tcPr>
           <w:p>
             <w:pPr>
@@ -2320,7 +2465,7 @@
         </w:tc>
         <w:tc>
           <w:tcPr>
-            <w:tcW w:type="dxa" w:w="1108"/>
+            <w:tcW w:type="dxa" w:w="997"/>
           </w:tcPr>
           <w:p>
             <w:pPr>
@@ -2336,7 +2481,7 @@
         </w:tc>
         <w:tc>
           <w:tcPr>
-            <w:tcW w:type="dxa" w:w="1108"/>
+            <w:tcW w:type="dxa" w:w="997"/>
           </w:tcPr>
           <w:p>
             <w:pPr>
@@ -2353,7 +2498,7 @@
         </w:tc>
         <w:tc>
           <w:tcPr>
-            <w:tcW w:type="dxa" w:w="1108"/>
+            <w:tcW w:type="dxa" w:w="997"/>
           </w:tcPr>
           <w:p>
             <w:pPr>
@@ -2371,7 +2516,7 @@
         </w:tc>
         <w:tc>
           <w:tcPr>
-            <w:tcW w:type="dxa" w:w="1108"/>
+            <w:tcW w:type="dxa" w:w="997"/>
           </w:tcPr>
           <w:p>
             <w:pPr>
@@ -2388,7 +2533,7 @@
         </w:tc>
         <w:tc>
           <w:tcPr>
-            <w:tcW w:type="dxa" w:w="1108"/>
+            <w:tcW w:type="dxa" w:w="997"/>
           </w:tcPr>
           <w:p>
             <w:pPr>
@@ -2405,7 +2550,7 @@
         </w:tc>
         <w:tc>
           <w:tcPr>
-            <w:tcW w:type="dxa" w:w="1108"/>
+            <w:tcW w:type="dxa" w:w="997"/>
           </w:tcPr>
           <w:p>
             <w:pPr>
@@ -2422,7 +2567,7 @@
         </w:tc>
         <w:tc>
           <w:tcPr>
-            <w:tcW w:type="dxa" w:w="1108"/>
+            <w:tcW w:type="dxa" w:w="997"/>
           </w:tcPr>
           <w:p>
             <w:pPr>
@@ -2439,7 +2584,7 @@
         </w:tc>
         <w:tc>
           <w:tcPr>
-            <w:tcW w:type="dxa" w:w="1108"/>
+            <w:tcW w:type="dxa" w:w="997"/>
           </w:tcPr>
           <w:p>
             <w:pPr>
@@ -2451,6 +2596,23 @@
                 <w:sz w:val="17"/>
               </w:rPr>
               <w:t>0.301</w:t>
+            </w:r>
+          </w:p>
+        </w:tc>
+        <w:tc>
+          <w:tcPr>
+            <w:tcW w:type="dxa" w:w="997"/>
+          </w:tcPr>
+          <w:p>
+            <w:pPr>
+              <w:spacing w:after="0"/>
+              <w:jc w:val="right"/>
+            </w:pPr>
+            <w:r>
+              <w:rPr>
+                <w:sz w:val="17"/>
+              </w:rPr>
+              <w:t>+0.094 (VGGish)</w:t>
             </w:r>
           </w:p>
         </w:tc>
@@ -2458,7 +2620,7 @@
       <w:tr>
         <w:tc>
           <w:tcPr>
-            <w:tcW w:type="dxa" w:w="1108"/>
+            <w:tcW w:type="dxa" w:w="997"/>
           </w:tcPr>
           <w:p>
             <w:pPr>
@@ -2474,7 +2636,7 @@
         </w:tc>
         <w:tc>
           <w:tcPr>
-            <w:tcW w:type="dxa" w:w="1108"/>
+            <w:tcW w:type="dxa" w:w="997"/>
           </w:tcPr>
           <w:p>
             <w:pPr>
@@ -2490,7 +2652,7 @@
         </w:tc>
         <w:tc>
           <w:tcPr>
-            <w:tcW w:type="dxa" w:w="1108"/>
+            <w:tcW w:type="dxa" w:w="997"/>
           </w:tcPr>
           <w:p>
             <w:pPr>
@@ -2507,7 +2669,7 @@
         </w:tc>
         <w:tc>
           <w:tcPr>
-            <w:tcW w:type="dxa" w:w="1108"/>
+            <w:tcW w:type="dxa" w:w="997"/>
           </w:tcPr>
           <w:p>
             <w:pPr>
@@ -2524,7 +2686,7 @@
         </w:tc>
         <w:tc>
           <w:tcPr>
-            <w:tcW w:type="dxa" w:w="1108"/>
+            <w:tcW w:type="dxa" w:w="997"/>
           </w:tcPr>
           <w:p>
             <w:pPr>
@@ -2541,7 +2703,7 @@
         </w:tc>
         <w:tc>
           <w:tcPr>
-            <w:tcW w:type="dxa" w:w="1108"/>
+            <w:tcW w:type="dxa" w:w="997"/>
           </w:tcPr>
           <w:p>
             <w:pPr>
@@ -2559,7 +2721,7 @@
         </w:tc>
         <w:tc>
           <w:tcPr>
-            <w:tcW w:type="dxa" w:w="1108"/>
+            <w:tcW w:type="dxa" w:w="997"/>
           </w:tcPr>
           <w:p>
             <w:pPr>
@@ -2576,7 +2738,7 @@
         </w:tc>
         <w:tc>
           <w:tcPr>
-            <w:tcW w:type="dxa" w:w="1108"/>
+            <w:tcW w:type="dxa" w:w="997"/>
           </w:tcPr>
           <w:p>
             <w:pPr>
@@ -2593,7 +2755,7 @@
         </w:tc>
         <w:tc>
           <w:tcPr>
-            <w:tcW w:type="dxa" w:w="1108"/>
+            <w:tcW w:type="dxa" w:w="997"/>
           </w:tcPr>
           <w:p>
             <w:pPr>
@@ -2605,6 +2767,23 @@
                 <w:sz w:val="17"/>
               </w:rPr>
               <w:t>0.133</w:t>
+            </w:r>
+          </w:p>
+        </w:tc>
+        <w:tc>
+          <w:tcPr>
+            <w:tcW w:type="dxa" w:w="997"/>
+          </w:tcPr>
+          <w:p>
+            <w:pPr>
+              <w:spacing w:after="0"/>
+              <w:jc w:val="right"/>
+            </w:pPr>
+            <w:r>
+              <w:rPr>
+                <w:sz w:val="17"/>
+              </w:rPr>
+              <w:t>−0.088 (AST)</w:t>
             </w:r>
           </w:p>
         </w:tc>
@@ -2612,7 +2791,7 @@
       <w:tr>
         <w:tc>
           <w:tcPr>
-            <w:tcW w:type="dxa" w:w="1108"/>
+            <w:tcW w:type="dxa" w:w="997"/>
           </w:tcPr>
           <w:p>
             <w:pPr>
@@ -2628,7 +2807,7 @@
         </w:tc>
         <w:tc>
           <w:tcPr>
-            <w:tcW w:type="dxa" w:w="1108"/>
+            <w:tcW w:type="dxa" w:w="997"/>
           </w:tcPr>
           <w:p>
             <w:pPr>
@@ -2644,7 +2823,7 @@
         </w:tc>
         <w:tc>
           <w:tcPr>
-            <w:tcW w:type="dxa" w:w="1108"/>
+            <w:tcW w:type="dxa" w:w="997"/>
           </w:tcPr>
           <w:p>
             <w:pPr>
@@ -2661,7 +2840,7 @@
         </w:tc>
         <w:tc>
           <w:tcPr>
-            <w:tcW w:type="dxa" w:w="1108"/>
+            <w:tcW w:type="dxa" w:w="997"/>
           </w:tcPr>
           <w:p>
             <w:pPr>
@@ -2678,7 +2857,7 @@
         </w:tc>
         <w:tc>
           <w:tcPr>
-            <w:tcW w:type="dxa" w:w="1108"/>
+            <w:tcW w:type="dxa" w:w="997"/>
           </w:tcPr>
           <w:p>
             <w:pPr>
@@ -2695,7 +2874,7 @@
         </w:tc>
         <w:tc>
           <w:tcPr>
-            <w:tcW w:type="dxa" w:w="1108"/>
+            <w:tcW w:type="dxa" w:w="997"/>
           </w:tcPr>
           <w:p>
             <w:pPr>
@@ -2713,7 +2892,7 @@
         </w:tc>
         <w:tc>
           <w:tcPr>
-            <w:tcW w:type="dxa" w:w="1108"/>
+            <w:tcW w:type="dxa" w:w="997"/>
           </w:tcPr>
           <w:p>
             <w:pPr>
@@ -2730,7 +2909,7 @@
         </w:tc>
         <w:tc>
           <w:tcPr>
-            <w:tcW w:type="dxa" w:w="1108"/>
+            <w:tcW w:type="dxa" w:w="997"/>
           </w:tcPr>
           <w:p>
             <w:pPr>
@@ -2747,7 +2926,7 @@
         </w:tc>
         <w:tc>
           <w:tcPr>
-            <w:tcW w:type="dxa" w:w="1108"/>
+            <w:tcW w:type="dxa" w:w="997"/>
           </w:tcPr>
           <w:p>
             <w:pPr>
@@ -2759,6 +2938,23 @@
                 <w:sz w:val="17"/>
               </w:rPr>
               <w:t>0.323</w:t>
+            </w:r>
+          </w:p>
+        </w:tc>
+        <w:tc>
+          <w:tcPr>
+            <w:tcW w:type="dxa" w:w="997"/>
+          </w:tcPr>
+          <w:p>
+            <w:pPr>
+              <w:spacing w:after="0"/>
+              <w:jc w:val="right"/>
+            </w:pPr>
+            <w:r>
+              <w:rPr>
+                <w:sz w:val="17"/>
+              </w:rPr>
+              <w:t>+0.090 (AST), worse</w:t>
             </w:r>
           </w:p>
         </w:tc>
@@ -2766,7 +2962,7 @@
       <w:tr>
         <w:tc>
           <w:tcPr>
-            <w:tcW w:type="dxa" w:w="1108"/>
+            <w:tcW w:type="dxa" w:w="997"/>
           </w:tcPr>
           <w:p>
             <w:pPr>
@@ -2782,7 +2978,7 @@
         </w:tc>
         <w:tc>
           <w:tcPr>
-            <w:tcW w:type="dxa" w:w="1108"/>
+            <w:tcW w:type="dxa" w:w="997"/>
           </w:tcPr>
           <w:p>
             <w:pPr>
@@ -2798,7 +2994,7 @@
         </w:tc>
         <w:tc>
           <w:tcPr>
-            <w:tcW w:type="dxa" w:w="1108"/>
+            <w:tcW w:type="dxa" w:w="997"/>
           </w:tcPr>
           <w:p>
             <w:pPr>
@@ -2815,7 +3011,7 @@
         </w:tc>
         <w:tc>
           <w:tcPr>
-            <w:tcW w:type="dxa" w:w="1108"/>
+            <w:tcW w:type="dxa" w:w="997"/>
           </w:tcPr>
           <w:p>
             <w:pPr>
@@ -2832,7 +3028,7 @@
         </w:tc>
         <w:tc>
           <w:tcPr>
-            <w:tcW w:type="dxa" w:w="1108"/>
+            <w:tcW w:type="dxa" w:w="997"/>
           </w:tcPr>
           <w:p>
             <w:pPr>
@@ -2849,7 +3045,7 @@
         </w:tc>
         <w:tc>
           <w:tcPr>
-            <w:tcW w:type="dxa" w:w="1108"/>
+            <w:tcW w:type="dxa" w:w="997"/>
           </w:tcPr>
           <w:p>
             <w:pPr>
@@ -2867,7 +3063,7 @@
         </w:tc>
         <w:tc>
           <w:tcPr>
-            <w:tcW w:type="dxa" w:w="1108"/>
+            <w:tcW w:type="dxa" w:w="997"/>
           </w:tcPr>
           <w:p>
             <w:pPr>
@@ -2884,7 +3080,7 @@
         </w:tc>
         <w:tc>
           <w:tcPr>
-            <w:tcW w:type="dxa" w:w="1108"/>
+            <w:tcW w:type="dxa" w:w="997"/>
           </w:tcPr>
           <w:p>
             <w:pPr>
@@ -2901,7 +3097,7 @@
         </w:tc>
         <w:tc>
           <w:tcPr>
-            <w:tcW w:type="dxa" w:w="1108"/>
+            <w:tcW w:type="dxa" w:w="997"/>
           </w:tcPr>
           <w:p>
             <w:pPr>
@@ -2913,6 +3109,23 @@
                 <w:sz w:val="17"/>
               </w:rPr>
               <w:t>0.355</w:t>
+            </w:r>
+          </w:p>
+        </w:tc>
+        <w:tc>
+          <w:tcPr>
+            <w:tcW w:type="dxa" w:w="997"/>
+          </w:tcPr>
+          <w:p>
+            <w:pPr>
+              <w:spacing w:after="0"/>
+              <w:jc w:val="right"/>
+            </w:pPr>
+            <w:r>
+              <w:rPr>
+                <w:sz w:val="17"/>
+              </w:rPr>
+              <w:t>−0.041 (AST)</w:t>
             </w:r>
           </w:p>
         </w:tc>
@@ -2920,7 +3133,7 @@
       <w:tr>
         <w:tc>
           <w:tcPr>
-            <w:tcW w:type="dxa" w:w="1108"/>
+            <w:tcW w:type="dxa" w:w="997"/>
           </w:tcPr>
           <w:p>
             <w:pPr>
@@ -2936,7 +3149,7 @@
         </w:tc>
         <w:tc>
           <w:tcPr>
-            <w:tcW w:type="dxa" w:w="1108"/>
+            <w:tcW w:type="dxa" w:w="997"/>
           </w:tcPr>
           <w:p>
             <w:pPr>
@@ -2952,7 +3165,7 @@
         </w:tc>
         <w:tc>
           <w:tcPr>
-            <w:tcW w:type="dxa" w:w="1108"/>
+            <w:tcW w:type="dxa" w:w="997"/>
           </w:tcPr>
           <w:p>
             <w:pPr>
@@ -2969,7 +3182,7 @@
         </w:tc>
         <w:tc>
           <w:tcPr>
-            <w:tcW w:type="dxa" w:w="1108"/>
+            <w:tcW w:type="dxa" w:w="997"/>
           </w:tcPr>
           <w:p>
             <w:pPr>
@@ -2987,7 +3200,7 @@
         </w:tc>
         <w:tc>
           <w:tcPr>
-            <w:tcW w:type="dxa" w:w="1108"/>
+            <w:tcW w:type="dxa" w:w="997"/>
           </w:tcPr>
           <w:p>
             <w:pPr>
@@ -3004,7 +3217,7 @@
         </w:tc>
         <w:tc>
           <w:tcPr>
-            <w:tcW w:type="dxa" w:w="1108"/>
+            <w:tcW w:type="dxa" w:w="997"/>
           </w:tcPr>
           <w:p>
             <w:pPr>
@@ -3021,7 +3234,7 @@
         </w:tc>
         <w:tc>
           <w:tcPr>
-            <w:tcW w:type="dxa" w:w="1108"/>
+            <w:tcW w:type="dxa" w:w="997"/>
           </w:tcPr>
           <w:p>
             <w:pPr>
@@ -3038,7 +3251,7 @@
         </w:tc>
         <w:tc>
           <w:tcPr>
-            <w:tcW w:type="dxa" w:w="1108"/>
+            <w:tcW w:type="dxa" w:w="997"/>
           </w:tcPr>
           <w:p>
             <w:pPr>
@@ -3055,7 +3268,7 @@
         </w:tc>
         <w:tc>
           <w:tcPr>
-            <w:tcW w:type="dxa" w:w="1108"/>
+            <w:tcW w:type="dxa" w:w="997"/>
           </w:tcPr>
           <w:p>
             <w:pPr>
@@ -3067,6 +3280,23 @@
                 <w:sz w:val="17"/>
               </w:rPr>
               <w:t>0.308</w:t>
+            </w:r>
+          </w:p>
+        </w:tc>
+        <w:tc>
+          <w:tcPr>
+            <w:tcW w:type="dxa" w:w="997"/>
+          </w:tcPr>
+          <w:p>
+            <w:pPr>
+              <w:spacing w:after="0"/>
+              <w:jc w:val="right"/>
+            </w:pPr>
+            <w:r>
+              <w:rPr>
+                <w:sz w:val="17"/>
+              </w:rPr>
+              <w:t>+0.015 (AST)</w:t>
             </w:r>
           </w:p>
         </w:tc>
@@ -3074,7 +3304,7 @@
       <w:tr>
         <w:tc>
           <w:tcPr>
-            <w:tcW w:type="dxa" w:w="1108"/>
+            <w:tcW w:type="dxa" w:w="997"/>
           </w:tcPr>
           <w:p>
             <w:pPr>
@@ -3090,7 +3320,7 @@
         </w:tc>
         <w:tc>
           <w:tcPr>
-            <w:tcW w:type="dxa" w:w="1108"/>
+            <w:tcW w:type="dxa" w:w="997"/>
           </w:tcPr>
           <w:p>
             <w:pPr>
@@ -3106,7 +3336,7 @@
         </w:tc>
         <w:tc>
           <w:tcPr>
-            <w:tcW w:type="dxa" w:w="1108"/>
+            <w:tcW w:type="dxa" w:w="997"/>
           </w:tcPr>
           <w:p>
             <w:pPr>
@@ -3123,7 +3353,7 @@
         </w:tc>
         <w:tc>
           <w:tcPr>
-            <w:tcW w:type="dxa" w:w="1108"/>
+            <w:tcW w:type="dxa" w:w="997"/>
           </w:tcPr>
           <w:p>
             <w:pPr>
@@ -3141,7 +3371,7 @@
         </w:tc>
         <w:tc>
           <w:tcPr>
-            <w:tcW w:type="dxa" w:w="1108"/>
+            <w:tcW w:type="dxa" w:w="997"/>
           </w:tcPr>
           <w:p>
             <w:pPr>
@@ -3158,7 +3388,7 @@
         </w:tc>
         <w:tc>
           <w:tcPr>
-            <w:tcW w:type="dxa" w:w="1108"/>
+            <w:tcW w:type="dxa" w:w="997"/>
           </w:tcPr>
           <w:p>
             <w:pPr>
@@ -3175,7 +3405,7 @@
         </w:tc>
         <w:tc>
           <w:tcPr>
-            <w:tcW w:type="dxa" w:w="1108"/>
+            <w:tcW w:type="dxa" w:w="997"/>
           </w:tcPr>
           <w:p>
             <w:pPr>
@@ -3192,7 +3422,7 @@
         </w:tc>
         <w:tc>
           <w:tcPr>
-            <w:tcW w:type="dxa" w:w="1108"/>
+            <w:tcW w:type="dxa" w:w="997"/>
           </w:tcPr>
           <w:p>
             <w:pPr>
@@ -3209,7 +3439,7 @@
         </w:tc>
         <w:tc>
           <w:tcPr>
-            <w:tcW w:type="dxa" w:w="1108"/>
+            <w:tcW w:type="dxa" w:w="997"/>
           </w:tcPr>
           <w:p>
             <w:pPr>
@@ -3221,6 +3451,23 @@
                 <w:sz w:val="17"/>
               </w:rPr>
               <w:t>0.308</w:t>
+            </w:r>
+          </w:p>
+        </w:tc>
+        <w:tc>
+          <w:tcPr>
+            <w:tcW w:type="dxa" w:w="997"/>
+          </w:tcPr>
+          <w:p>
+            <w:pPr>
+              <w:spacing w:after="0"/>
+              <w:jc w:val="right"/>
+            </w:pPr>
+            <w:r>
+              <w:rPr>
+                <w:sz w:val="17"/>
+              </w:rPr>
+              <w:t>+0.157 (VGGish)</w:t>
             </w:r>
           </w:p>
         </w:tc>
@@ -3244,15 +3491,16 @@
         <w:tblLook w:firstColumn="1" w:firstRow="1" w:lastColumn="0" w:lastRow="0" w:noHBand="0" w:noVBand="1" w:val="04A0"/>
       </w:tblPr>
       <w:tblGrid>
-        <w:gridCol w:w="2493"/>
-        <w:gridCol w:w="2493"/>
-        <w:gridCol w:w="2493"/>
-        <w:gridCol w:w="2493"/>
+        <w:gridCol w:w="1994"/>
+        <w:gridCol w:w="1994"/>
+        <w:gridCol w:w="1994"/>
+        <w:gridCol w:w="1994"/>
+        <w:gridCol w:w="1994"/>
       </w:tblGrid>
       <w:tr>
         <w:tc>
           <w:tcPr>
-            <w:tcW w:type="dxa" w:w="2493"/>
+            <w:tcW w:type="dxa" w:w="1994"/>
             <w:shd w:val="clear" w:color="auto" w:fill="E8E8E8"/>
           </w:tcPr>
           <w:p>
@@ -3270,7 +3518,7 @@
         </w:tc>
         <w:tc>
           <w:tcPr>
-            <w:tcW w:type="dxa" w:w="2493"/>
+            <w:tcW w:type="dxa" w:w="1994"/>
             <w:shd w:val="clear" w:color="auto" w:fill="E8E8E8"/>
           </w:tcPr>
           <w:p>
@@ -3288,7 +3536,7 @@
         </w:tc>
         <w:tc>
           <w:tcPr>
-            <w:tcW w:type="dxa" w:w="2493"/>
+            <w:tcW w:type="dxa" w:w="1994"/>
             <w:shd w:val="clear" w:color="auto" w:fill="E8E8E8"/>
           </w:tcPr>
           <w:p>
@@ -3306,7 +3554,7 @@
         </w:tc>
         <w:tc>
           <w:tcPr>
-            <w:tcW w:type="dxa" w:w="2493"/>
+            <w:tcW w:type="dxa" w:w="1994"/>
             <w:shd w:val="clear" w:color="auto" w:fill="E8E8E8"/>
           </w:tcPr>
           <w:p>
@@ -3319,6 +3567,24 @@
                 <w:sz w:val="17"/>
               </w:rPr>
               <w:t>vs PCA-8 control</w:t>
+            </w:r>
+          </w:p>
+        </w:tc>
+        <w:tc>
+          <w:tcPr>
+            <w:tcW w:type="dxa" w:w="1994"/>
+            <w:shd w:val="clear" w:color="auto" w:fill="E8E8E8"/>
+          </w:tcPr>
+          <w:p>
+            <w:pPr>
+              <w:spacing w:after="0"/>
+            </w:pPr>
+            <w:r>
+              <w:rPr>
+                <w:b/>
+                <w:sz w:val="17"/>
+              </w:rPr>
+              <w:t>vs best direct audio</w:t>
             </w:r>
           </w:p>
         </w:tc>
@@ -3326,7 +3592,7 @@
       <w:tr>
         <w:tc>
           <w:tcPr>
-            <w:tcW w:type="dxa" w:w="2493"/>
+            <w:tcW w:type="dxa" w:w="1994"/>
           </w:tcPr>
           <w:p>
             <w:pPr>
@@ -3342,7 +3608,7 @@
         </w:tc>
         <w:tc>
           <w:tcPr>
-            <w:tcW w:type="dxa" w:w="2493"/>
+            <w:tcW w:type="dxa" w:w="1994"/>
           </w:tcPr>
           <w:p>
             <w:pPr>
@@ -3365,7 +3631,7 @@
         </w:tc>
         <w:tc>
           <w:tcPr>
-            <w:tcW w:type="dxa" w:w="2493"/>
+            <w:tcW w:type="dxa" w:w="1994"/>
           </w:tcPr>
           <w:p>
             <w:pPr>
@@ -3388,7 +3654,7 @@
         </w:tc>
         <w:tc>
           <w:tcPr>
-            <w:tcW w:type="dxa" w:w="2493"/>
+            <w:tcW w:type="dxa" w:w="1994"/>
           </w:tcPr>
           <w:p>
             <w:pPr>
@@ -3400,6 +3666,35 @@
                 <w:sz w:val="17"/>
               </w:rPr>
               <w:t>+0.045, p = 0.029</w:t>
+            </w:r>
+            <w:r>
+              <w:rPr>
+                <w:sz w:val="17"/>
+              </w:rPr>
+              <w:t xml:space="preserve"> (10/10)</w:t>
+            </w:r>
+          </w:p>
+        </w:tc>
+        <w:tc>
+          <w:tcPr>
+            <w:tcW w:type="dxa" w:w="1994"/>
+          </w:tcPr>
+          <w:p>
+            <w:pPr>
+              <w:spacing w:after="0"/>
+            </w:pPr>
+            <w:r>
+              <w:rPr>
+                <w:sz w:val="17"/>
+              </w:rPr>
+              <w:t xml:space="preserve">VGGish: </w:t>
+            </w:r>
+            <w:r>
+              <w:rPr>
+                <w:b/>
+                <w:sz w:val="17"/>
+              </w:rPr>
+              <w:t>+0.041, p = 0.035</w:t>
             </w:r>
             <w:r>
               <w:rPr>
@@ -3413,7 +3708,7 @@
       <w:tr>
         <w:tc>
           <w:tcPr>
-            <w:tcW w:type="dxa" w:w="2493"/>
+            <w:tcW w:type="dxa" w:w="1994"/>
           </w:tcPr>
           <w:p>
             <w:pPr>
@@ -3429,7 +3724,7 @@
         </w:tc>
         <w:tc>
           <w:tcPr>
-            <w:tcW w:type="dxa" w:w="2493"/>
+            <w:tcW w:type="dxa" w:w="1994"/>
           </w:tcPr>
           <w:p>
             <w:pPr>
@@ -3445,7 +3740,7 @@
         </w:tc>
         <w:tc>
           <w:tcPr>
-            <w:tcW w:type="dxa" w:w="2493"/>
+            <w:tcW w:type="dxa" w:w="1994"/>
           </w:tcPr>
           <w:p>
             <w:pPr>
@@ -3461,7 +3756,7 @@
         </w:tc>
         <w:tc>
           <w:tcPr>
-            <w:tcW w:type="dxa" w:w="2493"/>
+            <w:tcW w:type="dxa" w:w="1994"/>
           </w:tcPr>
           <w:p>
             <w:pPr>
@@ -3472,6 +3767,22 @@
                 <w:sz w:val="17"/>
               </w:rPr>
               <w:t>+0.037, p = 0.078 (10/10)</w:t>
+            </w:r>
+          </w:p>
+        </w:tc>
+        <w:tc>
+          <w:tcPr>
+            <w:tcW w:type="dxa" w:w="1994"/>
+          </w:tcPr>
+          <w:p>
+            <w:pPr>
+              <w:spacing w:after="0"/>
+            </w:pPr>
+            <w:r>
+              <w:rPr>
+                <w:sz w:val="17"/>
+              </w:rPr>
+              <w:t>AST: −0.032, p = 0.27 (1/10)</w:t>
             </w:r>
           </w:p>
         </w:tc>
@@ -3479,7 +3790,7 @@
       <w:tr>
         <w:tc>
           <w:tcPr>
-            <w:tcW w:type="dxa" w:w="2493"/>
+            <w:tcW w:type="dxa" w:w="1994"/>
           </w:tcPr>
           <w:p>
             <w:pPr>
@@ -3495,7 +3806,7 @@
         </w:tc>
         <w:tc>
           <w:tcPr>
-            <w:tcW w:type="dxa" w:w="2493"/>
+            <w:tcW w:type="dxa" w:w="1994"/>
           </w:tcPr>
           <w:p>
             <w:pPr>
@@ -3518,7 +3829,7 @@
         </w:tc>
         <w:tc>
           <w:tcPr>
-            <w:tcW w:type="dxa" w:w="2493"/>
+            <w:tcW w:type="dxa" w:w="1994"/>
           </w:tcPr>
           <w:p>
             <w:pPr>
@@ -3534,7 +3845,7 @@
         </w:tc>
         <w:tc>
           <w:tcPr>
-            <w:tcW w:type="dxa" w:w="2493"/>
+            <w:tcW w:type="dxa" w:w="1994"/>
           </w:tcPr>
           <w:p>
             <w:pPr>
@@ -3552,6 +3863,22 @@
                 <w:sz w:val="17"/>
               </w:rPr>
               <w:t xml:space="preserve"> (10/10)</w:t>
+            </w:r>
+          </w:p>
+        </w:tc>
+        <w:tc>
+          <w:tcPr>
+            <w:tcW w:type="dxa" w:w="1994"/>
+          </w:tcPr>
+          <w:p>
+            <w:pPr>
+              <w:spacing w:after="0"/>
+            </w:pPr>
+            <w:r>
+              <w:rPr>
+                <w:sz w:val="17"/>
+              </w:rPr>
+              <w:t>AST: +0.020, p = 0.42 (7/10)</w:t>
             </w:r>
           </w:p>
         </w:tc>
@@ -3559,7 +3886,7 @@
       <w:tr>
         <w:tc>
           <w:tcPr>
-            <w:tcW w:type="dxa" w:w="2493"/>
+            <w:tcW w:type="dxa" w:w="1994"/>
           </w:tcPr>
           <w:p>
             <w:pPr>
@@ -3575,7 +3902,7 @@
         </w:tc>
         <w:tc>
           <w:tcPr>
-            <w:tcW w:type="dxa" w:w="2493"/>
+            <w:tcW w:type="dxa" w:w="1994"/>
           </w:tcPr>
           <w:p>
             <w:pPr>
@@ -3591,7 +3918,7 @@
         </w:tc>
         <w:tc>
           <w:tcPr>
-            <w:tcW w:type="dxa" w:w="2493"/>
+            <w:tcW w:type="dxa" w:w="1994"/>
           </w:tcPr>
           <w:p>
             <w:pPr>
@@ -3607,7 +3934,7 @@
         </w:tc>
         <w:tc>
           <w:tcPr>
-            <w:tcW w:type="dxa" w:w="2493"/>
+            <w:tcW w:type="dxa" w:w="1994"/>
           </w:tcPr>
           <w:p>
             <w:pPr>
@@ -3625,6 +3952,22 @@
                 <w:sz w:val="17"/>
               </w:rPr>
               <w:t xml:space="preserve"> (10/10)</w:t>
+            </w:r>
+          </w:p>
+        </w:tc>
+        <w:tc>
+          <w:tcPr>
+            <w:tcW w:type="dxa" w:w="1994"/>
+          </w:tcPr>
+          <w:p>
+            <w:pPr>
+              <w:spacing w:after="0"/>
+            </w:pPr>
+            <w:r>
+              <w:rPr>
+                <w:sz w:val="17"/>
+              </w:rPr>
+              <w:t>AST: −0.010, p = 0.70 (3/10)</w:t>
             </w:r>
           </w:p>
         </w:tc>
@@ -3632,7 +3975,7 @@
       <w:tr>
         <w:tc>
           <w:tcPr>
-            <w:tcW w:type="dxa" w:w="2493"/>
+            <w:tcW w:type="dxa" w:w="1994"/>
           </w:tcPr>
           <w:p>
             <w:pPr>
@@ -3648,7 +3991,7 @@
         </w:tc>
         <w:tc>
           <w:tcPr>
-            <w:tcW w:type="dxa" w:w="2493"/>
+            <w:tcW w:type="dxa" w:w="1994"/>
           </w:tcPr>
           <w:p>
             <w:pPr>
@@ -3664,7 +4007,7 @@
         </w:tc>
         <w:tc>
           <w:tcPr>
-            <w:tcW w:type="dxa" w:w="2493"/>
+            <w:tcW w:type="dxa" w:w="1994"/>
           </w:tcPr>
           <w:p>
             <w:pPr>
@@ -3680,7 +4023,7 @@
         </w:tc>
         <w:tc>
           <w:tcPr>
-            <w:tcW w:type="dxa" w:w="2493"/>
+            <w:tcW w:type="dxa" w:w="1994"/>
           </w:tcPr>
           <w:p>
             <w:pPr>
@@ -3691,6 +4034,22 @@
                 <w:sz w:val="17"/>
               </w:rPr>
               <w:t>−0.001, p = 0.92 (4/10)</w:t>
+            </w:r>
+          </w:p>
+        </w:tc>
+        <w:tc>
+          <w:tcPr>
+            <w:tcW w:type="dxa" w:w="1994"/>
+          </w:tcPr>
+          <w:p>
+            <w:pPr>
+              <w:spacing w:after="0"/>
+            </w:pPr>
+            <w:r>
+              <w:rPr>
+                <w:sz w:val="17"/>
+              </w:rPr>
+              <w:t>VGGish: +0.011, p = 0.44 (7/10)</w:t>
             </w:r>
           </w:p>
         </w:tc>
@@ -3698,7 +4057,7 @@
       <w:tr>
         <w:tc>
           <w:tcPr>
-            <w:tcW w:type="dxa" w:w="2493"/>
+            <w:tcW w:type="dxa" w:w="1994"/>
           </w:tcPr>
           <w:p>
             <w:pPr>
@@ -3714,7 +4073,7 @@
         </w:tc>
         <w:tc>
           <w:tcPr>
-            <w:tcW w:type="dxa" w:w="2493"/>
+            <w:tcW w:type="dxa" w:w="1994"/>
           </w:tcPr>
           <w:p>
             <w:pPr>
@@ -3730,7 +4089,7 @@
         </w:tc>
         <w:tc>
           <w:tcPr>
-            <w:tcW w:type="dxa" w:w="2493"/>
+            <w:tcW w:type="dxa" w:w="1994"/>
           </w:tcPr>
           <w:p>
             <w:pPr>
@@ -3746,7 +4105,7 @@
         </w:tc>
         <w:tc>
           <w:tcPr>
-            <w:tcW w:type="dxa" w:w="2493"/>
+            <w:tcW w:type="dxa" w:w="1994"/>
           </w:tcPr>
           <w:p>
             <w:pPr>
@@ -3757,6 +4116,22 @@
                 <w:sz w:val="17"/>
               </w:rPr>
               <w:t>+0.015, p = 0.46 (8/10)</w:t>
+            </w:r>
+          </w:p>
+        </w:tc>
+        <w:tc>
+          <w:tcPr>
+            <w:tcW w:type="dxa" w:w="1994"/>
+          </w:tcPr>
+          <w:p>
+            <w:pPr>
+              <w:spacing w:after="0"/>
+            </w:pPr>
+            <w:r>
+              <w:rPr>
+                <w:sz w:val="17"/>
+              </w:rPr>
+              <w:t>VGGish: +0.011, p = 0.53 (8/10)</w:t>
             </w:r>
           </w:p>
         </w:tc>
@@ -3764,7 +4139,7 @@
       <w:tr>
         <w:tc>
           <w:tcPr>
-            <w:tcW w:type="dxa" w:w="2493"/>
+            <w:tcW w:type="dxa" w:w="1994"/>
           </w:tcPr>
           <w:p>
             <w:pPr>
@@ -3780,7 +4155,7 @@
         </w:tc>
         <w:tc>
           <w:tcPr>
-            <w:tcW w:type="dxa" w:w="2493"/>
+            <w:tcW w:type="dxa" w:w="1994"/>
           </w:tcPr>
           <w:p>
             <w:pPr>
@@ -3796,7 +4171,7 @@
         </w:tc>
         <w:tc>
           <w:tcPr>
-            <w:tcW w:type="dxa" w:w="2493"/>
+            <w:tcW w:type="dxa" w:w="1994"/>
           </w:tcPr>
           <w:p>
             <w:pPr>
@@ -3812,7 +4187,7 @@
         </w:tc>
         <w:tc>
           <w:tcPr>
-            <w:tcW w:type="dxa" w:w="2493"/>
+            <w:tcW w:type="dxa" w:w="1994"/>
           </w:tcPr>
           <w:p>
             <w:pPr>
@@ -3823,6 +4198,22 @@
                 <w:sz w:val="17"/>
               </w:rPr>
               <w:t>+0.041, p = 0.12 (10/10)</w:t>
+            </w:r>
+          </w:p>
+        </w:tc>
+        <w:tc>
+          <w:tcPr>
+            <w:tcW w:type="dxa" w:w="1994"/>
+          </w:tcPr>
+          <w:p>
+            <w:pPr>
+              <w:spacing w:after="0"/>
+            </w:pPr>
+            <w:r>
+              <w:rPr>
+                <w:sz w:val="17"/>
+              </w:rPr>
+              <w:t>AST: +0.038, p = 0.19 (7/10)</w:t>
             </w:r>
           </w:p>
         </w:tc>
@@ -3830,7 +4221,7 @@
       <w:tr>
         <w:tc>
           <w:tcPr>
-            <w:tcW w:type="dxa" w:w="2493"/>
+            <w:tcW w:type="dxa" w:w="1994"/>
           </w:tcPr>
           <w:p>
             <w:pPr>
@@ -3846,7 +4237,7 @@
         </w:tc>
         <w:tc>
           <w:tcPr>
-            <w:tcW w:type="dxa" w:w="2493"/>
+            <w:tcW w:type="dxa" w:w="1994"/>
           </w:tcPr>
           <w:p>
             <w:pPr>
@@ -3869,7 +4260,7 @@
         </w:tc>
         <w:tc>
           <w:tcPr>
-            <w:tcW w:type="dxa" w:w="2493"/>
+            <w:tcW w:type="dxa" w:w="1994"/>
           </w:tcPr>
           <w:p>
             <w:pPr>
@@ -3892,7 +4283,7 @@
         </w:tc>
         <w:tc>
           <w:tcPr>
-            <w:tcW w:type="dxa" w:w="2493"/>
+            <w:tcW w:type="dxa" w:w="1994"/>
           </w:tcPr>
           <w:p>
             <w:pPr>
@@ -3903,6 +4294,35 @@
                 <w:sz w:val="17"/>
               </w:rPr>
               <w:t>+0.053, p = 0.32 (9/10)</w:t>
+            </w:r>
+          </w:p>
+        </w:tc>
+        <w:tc>
+          <w:tcPr>
+            <w:tcW w:type="dxa" w:w="1994"/>
+          </w:tcPr>
+          <w:p>
+            <w:pPr>
+              <w:spacing w:after="0"/>
+            </w:pPr>
+            <w:r>
+              <w:rPr>
+                <w:sz w:val="17"/>
+              </w:rPr>
+              <w:t xml:space="preserve">VGGish: </w:t>
+            </w:r>
+            <w:r>
+              <w:rPr>
+                <w:b/>
+                <w:sz w:val="17"/>
+              </w:rPr>
+              <w:t>+0.096, p = 0.041</w:t>
+            </w:r>
+            <w:r>
+              <w:rPr>
+                <w:sz w:val="17"/>
+              </w:rPr>
+              <w:t xml:space="preserve"> (10/10)</w:t>
             </w:r>
           </w:p>
         </w:tc>
@@ -6662,15 +7082,16 @@
         <w:tblLook w:firstColumn="1" w:firstRow="1" w:lastColumn="0" w:lastRow="0" w:noHBand="0" w:noVBand="1" w:val="04A0"/>
       </w:tblPr>
       <w:tblGrid>
-        <w:gridCol w:w="2493"/>
-        <w:gridCol w:w="2493"/>
-        <w:gridCol w:w="2493"/>
-        <w:gridCol w:w="2493"/>
+        <w:gridCol w:w="1994"/>
+        <w:gridCol w:w="1994"/>
+        <w:gridCol w:w="1994"/>
+        <w:gridCol w:w="1994"/>
+        <w:gridCol w:w="1994"/>
       </w:tblGrid>
       <w:tr>
         <w:tc>
           <w:tcPr>
-            <w:tcW w:type="dxa" w:w="2493"/>
+            <w:tcW w:type="dxa" w:w="1994"/>
             <w:shd w:val="clear" w:color="auto" w:fill="E8E8E8"/>
           </w:tcPr>
           <w:p>
@@ -6688,7 +7109,7 @@
         </w:tc>
         <w:tc>
           <w:tcPr>
-            <w:tcW w:type="dxa" w:w="2493"/>
+            <w:tcW w:type="dxa" w:w="1994"/>
             <w:shd w:val="clear" w:color="auto" w:fill="E8E8E8"/>
           </w:tcPr>
           <w:p>
@@ -6706,7 +7127,7 @@
         </w:tc>
         <w:tc>
           <w:tcPr>
-            <w:tcW w:type="dxa" w:w="2493"/>
+            <w:tcW w:type="dxa" w:w="1994"/>
             <w:shd w:val="clear" w:color="auto" w:fill="E8E8E8"/>
           </w:tcPr>
           <w:p>
@@ -6724,7 +7145,25 @@
         </w:tc>
         <w:tc>
           <w:tcPr>
-            <w:tcW w:type="dxa" w:w="2493"/>
+            <w:tcW w:type="dxa" w:w="1994"/>
+            <w:shd w:val="clear" w:color="auto" w:fill="E8E8E8"/>
+          </w:tcPr>
+          <w:p>
+            <w:pPr>
+              <w:spacing w:after="0"/>
+            </w:pPr>
+            <w:r>
+              <w:rPr>
+                <w:b/>
+                <w:sz w:val="17"/>
+              </w:rPr>
+              <w:t>Δ emotion − best direct</w:t>
+            </w:r>
+          </w:p>
+        </w:tc>
+        <w:tc>
+          <w:tcPr>
+            <w:tcW w:type="dxa" w:w="1994"/>
             <w:shd w:val="clear" w:color="auto" w:fill="E8E8E8"/>
           </w:tcPr>
           <w:p>
@@ -6744,7 +7183,7 @@
       <w:tr>
         <w:tc>
           <w:tcPr>
-            <w:tcW w:type="dxa" w:w="2493"/>
+            <w:tcW w:type="dxa" w:w="1994"/>
           </w:tcPr>
           <w:p>
             <w:pPr>
@@ -6760,7 +7199,7 @@
         </w:tc>
         <w:tc>
           <w:tcPr>
-            <w:tcW w:type="dxa" w:w="2493"/>
+            <w:tcW w:type="dxa" w:w="1994"/>
           </w:tcPr>
           <w:p>
             <w:pPr>
@@ -6777,7 +7216,7 @@
         </w:tc>
         <w:tc>
           <w:tcPr>
-            <w:tcW w:type="dxa" w:w="2493"/>
+            <w:tcW w:type="dxa" w:w="1994"/>
           </w:tcPr>
           <w:p>
             <w:pPr>
@@ -6788,13 +7227,30 @@
               <w:rPr>
                 <w:sz w:val="17"/>
               </w:rPr>
-              <w:t>0.377</w:t>
-            </w:r>
-          </w:p>
-        </w:tc>
-        <w:tc>
-          <w:tcPr>
-            <w:tcW w:type="dxa" w:w="2493"/>
+              <w:t>0.377 (VGGish)</w:t>
+            </w:r>
+          </w:p>
+        </w:tc>
+        <w:tc>
+          <w:tcPr>
+            <w:tcW w:type="dxa" w:w="1994"/>
+          </w:tcPr>
+          <w:p>
+            <w:pPr>
+              <w:spacing w:after="0"/>
+              <w:jc w:val="right"/>
+            </w:pPr>
+            <w:r>
+              <w:rPr>
+                <w:sz w:val="17"/>
+              </w:rPr>
+              <w:t>+0.040</w:t>
+            </w:r>
+          </w:p>
+        </w:tc>
+        <w:tc>
+          <w:tcPr>
+            <w:tcW w:type="dxa" w:w="1994"/>
           </w:tcPr>
           <w:p>
             <w:pPr>
@@ -6813,7 +7269,7 @@
       <w:tr>
         <w:tc>
           <w:tcPr>
-            <w:tcW w:type="dxa" w:w="2493"/>
+            <w:tcW w:type="dxa" w:w="1994"/>
           </w:tcPr>
           <w:p>
             <w:pPr>
@@ -6829,7 +7285,7 @@
         </w:tc>
         <w:tc>
           <w:tcPr>
-            <w:tcW w:type="dxa" w:w="2493"/>
+            <w:tcW w:type="dxa" w:w="1994"/>
           </w:tcPr>
           <w:p>
             <w:pPr>
@@ -6846,7 +7302,7 @@
         </w:tc>
         <w:tc>
           <w:tcPr>
-            <w:tcW w:type="dxa" w:w="2493"/>
+            <w:tcW w:type="dxa" w:w="1994"/>
           </w:tcPr>
           <w:p>
             <w:pPr>
@@ -6857,13 +7313,30 @@
               <w:rPr>
                 <w:sz w:val="17"/>
               </w:rPr>
-              <w:t>0.429</w:t>
-            </w:r>
-          </w:p>
-        </w:tc>
-        <w:tc>
-          <w:tcPr>
-            <w:tcW w:type="dxa" w:w="2493"/>
+              <w:t>0.429 (VGGish)</w:t>
+            </w:r>
+          </w:p>
+        </w:tc>
+        <w:tc>
+          <w:tcPr>
+            <w:tcW w:type="dxa" w:w="1994"/>
+          </w:tcPr>
+          <w:p>
+            <w:pPr>
+              <w:spacing w:after="0"/>
+              <w:jc w:val="right"/>
+            </w:pPr>
+            <w:r>
+              <w:rPr>
+                <w:sz w:val="17"/>
+              </w:rPr>
+              <w:t>+0.011</w:t>
+            </w:r>
+          </w:p>
+        </w:tc>
+        <w:tc>
+          <w:tcPr>
+            <w:tcW w:type="dxa" w:w="1994"/>
           </w:tcPr>
           <w:p>
             <w:pPr>
@@ -6882,7 +7355,7 @@
       <w:tr>
         <w:tc>
           <w:tcPr>
-            <w:tcW w:type="dxa" w:w="2493"/>
+            <w:tcW w:type="dxa" w:w="1994"/>
           </w:tcPr>
           <w:p>
             <w:pPr>
@@ -6898,7 +7371,7 @@
         </w:tc>
         <w:tc>
           <w:tcPr>
-            <w:tcW w:type="dxa" w:w="2493"/>
+            <w:tcW w:type="dxa" w:w="1994"/>
           </w:tcPr>
           <w:p>
             <w:pPr>
@@ -6916,7 +7389,7 @@
         </w:tc>
         <w:tc>
           <w:tcPr>
-            <w:tcW w:type="dxa" w:w="2493"/>
+            <w:tcW w:type="dxa" w:w="1994"/>
           </w:tcPr>
           <w:p>
             <w:pPr>
@@ -6927,13 +7400,31 @@
               <w:rPr>
                 <w:sz w:val="17"/>
               </w:rPr>
-              <w:t>0.407</w:t>
-            </w:r>
-          </w:p>
-        </w:tc>
-        <w:tc>
-          <w:tcPr>
-            <w:tcW w:type="dxa" w:w="2493"/>
+              <w:t>0.407 (VGGish)</w:t>
+            </w:r>
+          </w:p>
+        </w:tc>
+        <w:tc>
+          <w:tcPr>
+            <w:tcW w:type="dxa" w:w="1994"/>
+          </w:tcPr>
+          <w:p>
+            <w:pPr>
+              <w:spacing w:after="0"/>
+              <w:jc w:val="right"/>
+            </w:pPr>
+            <w:r>
+              <w:rPr>
+                <w:b/>
+                <w:sz w:val="17"/>
+              </w:rPr>
+              <w:t>+0.105</w:t>
+            </w:r>
+          </w:p>
+        </w:tc>
+        <w:tc>
+          <w:tcPr>
+            <w:tcW w:type="dxa" w:w="1994"/>
           </w:tcPr>
           <w:p>
             <w:pPr>
@@ -6952,7 +7443,7 @@
       <w:tr>
         <w:tc>
           <w:tcPr>
-            <w:tcW w:type="dxa" w:w="2493"/>
+            <w:tcW w:type="dxa" w:w="1994"/>
           </w:tcPr>
           <w:p>
             <w:pPr>
@@ -6968,7 +7459,7 @@
         </w:tc>
         <w:tc>
           <w:tcPr>
-            <w:tcW w:type="dxa" w:w="2493"/>
+            <w:tcW w:type="dxa" w:w="1994"/>
           </w:tcPr>
           <w:p>
             <w:pPr>
@@ -6985,7 +7476,7 @@
         </w:tc>
         <w:tc>
           <w:tcPr>
-            <w:tcW w:type="dxa" w:w="2493"/>
+            <w:tcW w:type="dxa" w:w="1994"/>
           </w:tcPr>
           <w:p>
             <w:pPr>
@@ -6996,13 +7487,30 @@
               <w:rPr>
                 <w:sz w:val="17"/>
               </w:rPr>
-              <w:t>0.593</w:t>
-            </w:r>
-          </w:p>
-        </w:tc>
-        <w:tc>
-          <w:tcPr>
-            <w:tcW w:type="dxa" w:w="2493"/>
+              <w:t>0.621 (VGGish, majority vote over cues)</w:t>
+            </w:r>
+          </w:p>
+        </w:tc>
+        <w:tc>
+          <w:tcPr>
+            <w:tcW w:type="dxa" w:w="1994"/>
+          </w:tcPr>
+          <w:p>
+            <w:pPr>
+              <w:spacing w:after="0"/>
+              <w:jc w:val="right"/>
+            </w:pPr>
+            <w:r>
+              <w:rPr>
+                <w:sz w:val="17"/>
+              </w:rPr>
+              <w:t>−0.005</w:t>
+            </w:r>
+          </w:p>
+        </w:tc>
+        <w:tc>
+          <w:tcPr>
+            <w:tcW w:type="dxa" w:w="1994"/>
           </w:tcPr>
           <w:p>
             <w:pPr>
@@ -7023,6 +7531,11 @@
       <w:pPr>
         <w:spacing w:after="40"/>
       </w:pPr>
+    </w:p>
+    <w:p>
+      <w:r>
+        <w:t>On Blockbuster in-domain the best direct route is VGGish classified per cue with a majority vote over each film's cues (the architecture of Ma et al., 0.621). It is 0.005 ahead of the emotion route. This pair was not tested; for scale, majority voting's own lead over plain averaging (+0.028) is not significant (p = 0.388). The matched comparison with the same film-level VGGish embedding the emotion route starts from (0.593) is the one the thesis tests: +0.023, Nadeau–Bengio p = 0.536. The zero-shot Δ of +0.105 is the difference of the two scores; the bootstrap mean quoted below is +0.106.</w:t>
+      </w:r>
     </w:p>
     <w:p>
       <w:r>

</xml_diff>

<commit_message>
Briefing: SDs at film and clip level, Q&A and figure list brought in line with film-level scoring; stale reverse-direction p-values annotated; chapter copies synced
Co-Authored-By: Claude Opus 5.5 <noreply@anthropic.com>
</commit_message>
<xml_diff>
--- a/docs/current_state.docx
+++ b/docs/current_state.docx
@@ -4521,7 +4521,7 @@
         <w:t>SD over the 10 repeats: the luck of the split.</w:t>
       </w:r>
       <w:r>
-        <w:t xml:space="preserve"> One 5-fold run splits the 41 films into 5 groups at random. We repeat that with 10 different splits and compute macro-F1 once per repeat (on all 329 clips' out-of-fold predictions). The SD of these 10 numbers says how much the score depends on </w:t>
+        <w:t xml:space="preserve"> One 5-fold run splits the 41 films into 5 groups at random. We repeat that with 10 different splits and compute macro-F1 once per repeat (on the out-of-fold predictions of all 41 films, or all 329 clips). The SD of these 10 numbers says how much the score depends on </w:t>
       </w:r>
       <w:r>
         <w:rPr>
@@ -4575,7 +4575,7 @@
         <w:t>with replacement</w:t>
       </w:r>
       <w:r>
-        <w:t xml:space="preserve"> 1000 times, re-scores the same predictions on each draw, and measures the spread. This is the </w:t>
+        <w:t xml:space="preserve"> 2000 times (1000 in the clip-level metric analysis), re-scores the same predictions on each draw, and measures the spread. This is the </w:t>
       </w:r>
       <w:r>
         <w:rPr>
@@ -4624,7 +4624,27 @@
     </w:p>
     <w:p>
       <w:r>
-        <w:t>Macro-F1, 5 genres:</w:t>
+        <w:t xml:space="preserve">Five genres. </w:t>
+      </w:r>
+      <w:r>
+        <w:rPr>
+          <w:b/>
+        </w:rPr>
+        <w:t>Film level</w:t>
+      </w:r>
+      <w:r>
+        <w:t xml:space="preserve"> (the headline since 7 Oct; </w:t>
+      </w:r>
+      <w:r>
+        <w:rPr>
+          <w:rFonts w:ascii="Consolas" w:hAnsi="Consolas"/>
+          <w:color w:val="404040"/>
+          <w:sz w:val="18"/>
+        </w:rPr>
+        <w:t>results/film_level.json</w:t>
+      </w:r>
+      <w:r>
+        <w:t>). The single-fold SD has no film-level version, because a test fold holds about 8 films and most genres have no positive film in it.</w:t>
       </w:r>
     </w:p>
     <w:tbl>
@@ -4692,7 +4712,7 @@
                 <w:b/>
                 <w:sz w:val="17"/>
               </w:rPr>
-              <w:t>2. single folds</w:t>
+              <w:t>the 10 repeats lie in</w:t>
             </w:r>
           </w:p>
         </w:tc>
@@ -4763,7 +4783,7 @@
               <w:rPr>
                 <w:sz w:val="17"/>
               </w:rPr>
-              <w:t>0.009</w:t>
+              <w:t>0.017</w:t>
             </w:r>
           </w:p>
         </w:tc>
@@ -4774,13 +4794,29 @@
           <w:p>
             <w:pPr>
               <w:spacing w:after="0"/>
+            </w:pPr>
+            <w:r>
+              <w:rPr>
+                <w:sz w:val="17"/>
+              </w:rPr>
+              <w:t>0.486–0.543</w:t>
+            </w:r>
+          </w:p>
+        </w:tc>
+        <w:tc>
+          <w:tcPr>
+            <w:tcW w:type="dxa" w:w="1994"/>
+          </w:tcPr>
+          <w:p>
+            <w:pPr>
+              <w:spacing w:after="0"/>
               <w:jc w:val="right"/>
             </w:pPr>
             <w:r>
               <w:rPr>
                 <w:sz w:val="17"/>
               </w:rPr>
-              <w:t>0.057</w:t>
+              <w:t>0.038</w:t>
             </w:r>
           </w:p>
         </w:tc>
@@ -4797,24 +4833,7 @@
               <w:rPr>
                 <w:sz w:val="17"/>
               </w:rPr>
-              <w:t>0.027</w:t>
-            </w:r>
-          </w:p>
-        </w:tc>
-        <w:tc>
-          <w:tcPr>
-            <w:tcW w:type="dxa" w:w="1994"/>
-          </w:tcPr>
-          <w:p>
-            <w:pPr>
-              <w:spacing w:after="0"/>
-              <w:jc w:val="right"/>
-            </w:pPr>
-            <w:r>
-              <w:rPr>
-                <w:sz w:val="17"/>
-              </w:rPr>
-              <w:t>0.002</w:t>
+              <w:t>0.011</w:t>
             </w:r>
           </w:p>
         </w:tc>
@@ -4851,7 +4870,7 @@
                 <w:b/>
                 <w:sz w:val="17"/>
               </w:rPr>
-              <w:t>0.011</w:t>
+              <w:t>0.026</w:t>
             </w:r>
           </w:p>
         </w:tc>
@@ -4862,13 +4881,29 @@
           <w:p>
             <w:pPr>
               <w:spacing w:after="0"/>
+            </w:pPr>
+            <w:r>
+              <w:rPr>
+                <w:sz w:val="17"/>
+              </w:rPr>
+              <w:t>0.423–0.513</w:t>
+            </w:r>
+          </w:p>
+        </w:tc>
+        <w:tc>
+          <w:tcPr>
+            <w:tcW w:type="dxa" w:w="1994"/>
+          </w:tcPr>
+          <w:p>
+            <w:pPr>
+              <w:spacing w:after="0"/>
               <w:jc w:val="right"/>
             </w:pPr>
             <w:r>
               <w:rPr>
                 <w:sz w:val="17"/>
               </w:rPr>
-              <w:t>0.054</w:t>
+              <w:t>0.035</w:t>
             </w:r>
           </w:p>
         </w:tc>
@@ -4885,24 +4920,7 @@
               <w:rPr>
                 <w:sz w:val="17"/>
               </w:rPr>
-              <w:t>0.024</w:t>
-            </w:r>
-          </w:p>
-        </w:tc>
-        <w:tc>
-          <w:tcPr>
-            <w:tcW w:type="dxa" w:w="1994"/>
-          </w:tcPr>
-          <w:p>
-            <w:pPr>
-              <w:spacing w:after="0"/>
-              <w:jc w:val="right"/>
-            </w:pPr>
-            <w:r>
-              <w:rPr>
-                <w:sz w:val="17"/>
-              </w:rPr>
-              <w:t>0.003</w:t>
+              <w:t>0.010</w:t>
             </w:r>
           </w:p>
         </w:tc>
@@ -4937,7 +4955,7 @@
               <w:rPr>
                 <w:sz w:val="17"/>
               </w:rPr>
-              <w:t>0.020</w:t>
+              <w:t>0.055</w:t>
             </w:r>
           </w:p>
         </w:tc>
@@ -4948,13 +4966,29 @@
           <w:p>
             <w:pPr>
               <w:spacing w:after="0"/>
+            </w:pPr>
+            <w:r>
+              <w:rPr>
+                <w:sz w:val="17"/>
+              </w:rPr>
+              <w:t>0.281–0.442</w:t>
+            </w:r>
+          </w:p>
+        </w:tc>
+        <w:tc>
+          <w:tcPr>
+            <w:tcW w:type="dxa" w:w="1994"/>
+          </w:tcPr>
+          <w:p>
+            <w:pPr>
+              <w:spacing w:after="0"/>
               <w:jc w:val="right"/>
             </w:pPr>
             <w:r>
               <w:rPr>
                 <w:sz w:val="17"/>
               </w:rPr>
-              <w:t>0.057</w:t>
+              <w:t>0.037</w:t>
             </w:r>
           </w:p>
         </w:tc>
@@ -4971,24 +5005,7 @@
               <w:rPr>
                 <w:sz w:val="17"/>
               </w:rPr>
-              <w:t>0.023</w:t>
-            </w:r>
-          </w:p>
-        </w:tc>
-        <w:tc>
-          <w:tcPr>
-            <w:tcW w:type="dxa" w:w="1994"/>
-          </w:tcPr>
-          <w:p>
-            <w:pPr>
-              <w:spacing w:after="0"/>
-              <w:jc w:val="right"/>
-            </w:pPr>
-            <w:r>
-              <w:rPr>
-                <w:sz w:val="17"/>
-              </w:rPr>
-              <w:t>0.008</w:t>
+              <w:t>0.015</w:t>
             </w:r>
           </w:p>
         </w:tc>
@@ -5023,7 +5040,7 @@
               <w:rPr>
                 <w:sz w:val="17"/>
               </w:rPr>
-              <w:t>0.023</w:t>
+              <w:t>0.047</w:t>
             </w:r>
           </w:p>
         </w:tc>
@@ -5034,13 +5051,29 @@
           <w:p>
             <w:pPr>
               <w:spacing w:after="0"/>
+            </w:pPr>
+            <w:r>
+              <w:rPr>
+                <w:sz w:val="17"/>
+              </w:rPr>
+              <w:t>0.204–0.364</w:t>
+            </w:r>
+          </w:p>
+        </w:tc>
+        <w:tc>
+          <w:tcPr>
+            <w:tcW w:type="dxa" w:w="1994"/>
+          </w:tcPr>
+          <w:p>
+            <w:pPr>
+              <w:spacing w:after="0"/>
               <w:jc w:val="right"/>
             </w:pPr>
             <w:r>
               <w:rPr>
                 <w:sz w:val="17"/>
               </w:rPr>
-              <w:t>0.050</w:t>
+              <w:t>0.027</w:t>
             </w:r>
           </w:p>
         </w:tc>
@@ -5057,24 +5090,7 @@
               <w:rPr>
                 <w:sz w:val="17"/>
               </w:rPr>
-              <w:t>0.018</w:t>
-            </w:r>
-          </w:p>
-        </w:tc>
-        <w:tc>
-          <w:tcPr>
-            <w:tcW w:type="dxa" w:w="1994"/>
-          </w:tcPr>
-          <w:p>
-            <w:pPr>
-              <w:spacing w:after="0"/>
-              <w:jc w:val="right"/>
-            </w:pPr>
-            <w:r>
-              <w:rPr>
-                <w:sz w:val="17"/>
-              </w:rPr>
-              <w:t>0.001</w:t>
+              <w:t>0.008</w:t>
             </w:r>
           </w:p>
         </w:tc>
@@ -5109,7 +5125,7 @@
               <w:rPr>
                 <w:sz w:val="17"/>
               </w:rPr>
-              <w:t>0.015</w:t>
+              <w:t>0.028</w:t>
             </w:r>
           </w:p>
         </w:tc>
@@ -5120,13 +5136,29 @@
           <w:p>
             <w:pPr>
               <w:spacing w:after="0"/>
+            </w:pPr>
+            <w:r>
+              <w:rPr>
+                <w:sz w:val="17"/>
+              </w:rPr>
+              <w:t>0.372–0.449</w:t>
+            </w:r>
+          </w:p>
+        </w:tc>
+        <w:tc>
+          <w:tcPr>
+            <w:tcW w:type="dxa" w:w="1994"/>
+          </w:tcPr>
+          <w:p>
+            <w:pPr>
+              <w:spacing w:after="0"/>
               <w:jc w:val="right"/>
             </w:pPr>
             <w:r>
               <w:rPr>
                 <w:sz w:val="17"/>
               </w:rPr>
-              <w:t>0.061</w:t>
+              <w:t>0.044</w:t>
             </w:r>
           </w:p>
         </w:tc>
@@ -5143,24 +5175,7 @@
               <w:rPr>
                 <w:sz w:val="17"/>
               </w:rPr>
-              <w:t>0.026</w:t>
-            </w:r>
-          </w:p>
-        </w:tc>
-        <w:tc>
-          <w:tcPr>
-            <w:tcW w:type="dxa" w:w="1994"/>
-          </w:tcPr>
-          <w:p>
-            <w:pPr>
-              <w:spacing w:after="0"/>
-              <w:jc w:val="right"/>
-            </w:pPr>
-            <w:r>
-              <w:rPr>
-                <w:sz w:val="17"/>
-              </w:rPr>
-              <w:t>0.004</w:t>
+              <w:t>0.008</w:t>
             </w:r>
           </w:p>
         </w:tc>
@@ -5173,7 +5188,572 @@
     </w:p>
     <w:p>
       <w:r>
-        <w:t>How to read it, for the emotion route (score 0.417):</w:t>
+        <w:rPr>
+          <w:b/>
+        </w:rPr>
+        <w:t>Clip level</w:t>
+      </w:r>
+      <w:r>
+        <w:t xml:space="preserve"> (the check; </w:t>
+      </w:r>
+      <w:r>
+        <w:rPr>
+          <w:rFonts w:ascii="Consolas" w:hAnsi="Consolas"/>
+          <w:color w:val="404040"/>
+          <w:sz w:val="18"/>
+        </w:rPr>
+        <w:t>results/metrics_stability.json</w:t>
+      </w:r>
+      <w:r>
+        <w:t>):</w:t>
+      </w:r>
+    </w:p>
+    <w:tbl>
+      <w:tblPr>
+        <w:tblStyle w:val="TableGrid"/>
+        <w:tblW w:type="auto" w:w="0"/>
+        <w:jc w:val="center"/>
+        <w:tblLook w:firstColumn="1" w:firstRow="1" w:lastColumn="0" w:lastRow="0" w:noHBand="0" w:noVBand="1" w:val="04A0"/>
+      </w:tblPr>
+      <w:tblGrid>
+        <w:gridCol w:w="1994"/>
+        <w:gridCol w:w="1994"/>
+        <w:gridCol w:w="1994"/>
+        <w:gridCol w:w="1994"/>
+        <w:gridCol w:w="1994"/>
+      </w:tblGrid>
+      <w:tr>
+        <w:tc>
+          <w:tcPr>
+            <w:tcW w:type="dxa" w:w="1994"/>
+            <w:shd w:val="clear" w:color="auto" w:fill="E8E8E8"/>
+          </w:tcPr>
+          <w:p>
+            <w:pPr>
+              <w:spacing w:after="0"/>
+            </w:pPr>
+            <w:r>
+              <w:rPr>
+                <w:b/>
+                <w:sz w:val="17"/>
+              </w:rPr>
+              <w:t>route</w:t>
+            </w:r>
+          </w:p>
+        </w:tc>
+        <w:tc>
+          <w:tcPr>
+            <w:tcW w:type="dxa" w:w="1994"/>
+            <w:shd w:val="clear" w:color="auto" w:fill="E8E8E8"/>
+          </w:tcPr>
+          <w:p>
+            <w:pPr>
+              <w:spacing w:after="0"/>
+            </w:pPr>
+            <w:r>
+              <w:rPr>
+                <w:b/>
+                <w:sz w:val="17"/>
+              </w:rPr>
+              <w:t>1. repeats (split)</w:t>
+            </w:r>
+          </w:p>
+        </w:tc>
+        <w:tc>
+          <w:tcPr>
+            <w:tcW w:type="dxa" w:w="1994"/>
+            <w:shd w:val="clear" w:color="auto" w:fill="E8E8E8"/>
+          </w:tcPr>
+          <w:p>
+            <w:pPr>
+              <w:spacing w:after="0"/>
+            </w:pPr>
+            <w:r>
+              <w:rPr>
+                <w:b/>
+                <w:sz w:val="17"/>
+              </w:rPr>
+              <w:t>2. single folds</w:t>
+            </w:r>
+          </w:p>
+        </w:tc>
+        <w:tc>
+          <w:tcPr>
+            <w:tcW w:type="dxa" w:w="1994"/>
+            <w:shd w:val="clear" w:color="auto" w:fill="E8E8E8"/>
+          </w:tcPr>
+          <w:p>
+            <w:pPr>
+              <w:spacing w:after="0"/>
+            </w:pPr>
+            <w:r>
+              <w:rPr>
+                <w:b/>
+                <w:sz w:val="17"/>
+              </w:rPr>
+              <w:t>3. bootstrap SE (films)</w:t>
+            </w:r>
+          </w:p>
+        </w:tc>
+        <w:tc>
+          <w:tcPr>
+            <w:tcW w:type="dxa" w:w="1994"/>
+            <w:shd w:val="clear" w:color="auto" w:fill="E8E8E8"/>
+          </w:tcPr>
+          <w:p>
+            <w:pPr>
+              <w:spacing w:after="0"/>
+            </w:pPr>
+            <w:r>
+              <w:rPr>
+                <w:b/>
+                <w:sz w:val="17"/>
+              </w:rPr>
+              <w:t>4. seeds (random numbers)</w:t>
+            </w:r>
+          </w:p>
+        </w:tc>
+      </w:tr>
+      <w:tr>
+        <w:tc>
+          <w:tcPr>
+            <w:tcW w:type="dxa" w:w="1994"/>
+          </w:tcPr>
+          <w:p>
+            <w:pPr>
+              <w:spacing w:after="0"/>
+            </w:pPr>
+            <w:r>
+              <w:rPr>
+                <w:sz w:val="17"/>
+              </w:rPr>
+              <w:t>human ratings (ceiling)</w:t>
+            </w:r>
+          </w:p>
+        </w:tc>
+        <w:tc>
+          <w:tcPr>
+            <w:tcW w:type="dxa" w:w="1994"/>
+          </w:tcPr>
+          <w:p>
+            <w:pPr>
+              <w:spacing w:after="0"/>
+              <w:jc w:val="right"/>
+            </w:pPr>
+            <w:r>
+              <w:rPr>
+                <w:sz w:val="17"/>
+              </w:rPr>
+              <w:t>0.009</w:t>
+            </w:r>
+          </w:p>
+        </w:tc>
+        <w:tc>
+          <w:tcPr>
+            <w:tcW w:type="dxa" w:w="1994"/>
+          </w:tcPr>
+          <w:p>
+            <w:pPr>
+              <w:spacing w:after="0"/>
+              <w:jc w:val="right"/>
+            </w:pPr>
+            <w:r>
+              <w:rPr>
+                <w:sz w:val="17"/>
+              </w:rPr>
+              <w:t>0.057</w:t>
+            </w:r>
+          </w:p>
+        </w:tc>
+        <w:tc>
+          <w:tcPr>
+            <w:tcW w:type="dxa" w:w="1994"/>
+          </w:tcPr>
+          <w:p>
+            <w:pPr>
+              <w:spacing w:after="0"/>
+              <w:jc w:val="right"/>
+            </w:pPr>
+            <w:r>
+              <w:rPr>
+                <w:sz w:val="17"/>
+              </w:rPr>
+              <w:t>0.027</w:t>
+            </w:r>
+          </w:p>
+        </w:tc>
+        <w:tc>
+          <w:tcPr>
+            <w:tcW w:type="dxa" w:w="1994"/>
+          </w:tcPr>
+          <w:p>
+            <w:pPr>
+              <w:spacing w:after="0"/>
+              <w:jc w:val="right"/>
+            </w:pPr>
+            <w:r>
+              <w:rPr>
+                <w:sz w:val="17"/>
+              </w:rPr>
+              <w:t>0.002</w:t>
+            </w:r>
+          </w:p>
+        </w:tc>
+      </w:tr>
+      <w:tr>
+        <w:tc>
+          <w:tcPr>
+            <w:tcW w:type="dxa" w:w="1994"/>
+          </w:tcPr>
+          <w:p>
+            <w:pPr>
+              <w:spacing w:after="0"/>
+            </w:pPr>
+            <w:r>
+              <w:rPr>
+                <w:b/>
+                <w:sz w:val="17"/>
+              </w:rPr>
+              <w:t>emotion route</w:t>
+            </w:r>
+          </w:p>
+        </w:tc>
+        <w:tc>
+          <w:tcPr>
+            <w:tcW w:type="dxa" w:w="1994"/>
+          </w:tcPr>
+          <w:p>
+            <w:pPr>
+              <w:spacing w:after="0"/>
+              <w:jc w:val="right"/>
+            </w:pPr>
+            <w:r>
+              <w:rPr>
+                <w:sz w:val="17"/>
+              </w:rPr>
+              <w:t>0.011</w:t>
+            </w:r>
+          </w:p>
+        </w:tc>
+        <w:tc>
+          <w:tcPr>
+            <w:tcW w:type="dxa" w:w="1994"/>
+          </w:tcPr>
+          <w:p>
+            <w:pPr>
+              <w:spacing w:after="0"/>
+              <w:jc w:val="right"/>
+            </w:pPr>
+            <w:r>
+              <w:rPr>
+                <w:sz w:val="17"/>
+              </w:rPr>
+              <w:t>0.054</w:t>
+            </w:r>
+          </w:p>
+        </w:tc>
+        <w:tc>
+          <w:tcPr>
+            <w:tcW w:type="dxa" w:w="1994"/>
+          </w:tcPr>
+          <w:p>
+            <w:pPr>
+              <w:spacing w:after="0"/>
+              <w:jc w:val="right"/>
+            </w:pPr>
+            <w:r>
+              <w:rPr>
+                <w:sz w:val="17"/>
+              </w:rPr>
+              <w:t>0.024</w:t>
+            </w:r>
+          </w:p>
+        </w:tc>
+        <w:tc>
+          <w:tcPr>
+            <w:tcW w:type="dxa" w:w="1994"/>
+          </w:tcPr>
+          <w:p>
+            <w:pPr>
+              <w:spacing w:after="0"/>
+              <w:jc w:val="right"/>
+            </w:pPr>
+            <w:r>
+              <w:rPr>
+                <w:sz w:val="17"/>
+              </w:rPr>
+              <w:t>0.003</w:t>
+            </w:r>
+          </w:p>
+        </w:tc>
+      </w:tr>
+      <w:tr>
+        <w:tc>
+          <w:tcPr>
+            <w:tcW w:type="dxa" w:w="1994"/>
+          </w:tcPr>
+          <w:p>
+            <w:pPr>
+              <w:spacing w:after="0"/>
+            </w:pPr>
+            <w:r>
+              <w:rPr>
+                <w:sz w:val="17"/>
+              </w:rPr>
+              <w:t>direct VGGish</w:t>
+            </w:r>
+          </w:p>
+        </w:tc>
+        <w:tc>
+          <w:tcPr>
+            <w:tcW w:type="dxa" w:w="1994"/>
+          </w:tcPr>
+          <w:p>
+            <w:pPr>
+              <w:spacing w:after="0"/>
+              <w:jc w:val="right"/>
+            </w:pPr>
+            <w:r>
+              <w:rPr>
+                <w:sz w:val="17"/>
+              </w:rPr>
+              <w:t>0.020</w:t>
+            </w:r>
+          </w:p>
+        </w:tc>
+        <w:tc>
+          <w:tcPr>
+            <w:tcW w:type="dxa" w:w="1994"/>
+          </w:tcPr>
+          <w:p>
+            <w:pPr>
+              <w:spacing w:after="0"/>
+              <w:jc w:val="right"/>
+            </w:pPr>
+            <w:r>
+              <w:rPr>
+                <w:sz w:val="17"/>
+              </w:rPr>
+              <w:t>0.057</w:t>
+            </w:r>
+          </w:p>
+        </w:tc>
+        <w:tc>
+          <w:tcPr>
+            <w:tcW w:type="dxa" w:w="1994"/>
+          </w:tcPr>
+          <w:p>
+            <w:pPr>
+              <w:spacing w:after="0"/>
+              <w:jc w:val="right"/>
+            </w:pPr>
+            <w:r>
+              <w:rPr>
+                <w:sz w:val="17"/>
+              </w:rPr>
+              <w:t>0.023</w:t>
+            </w:r>
+          </w:p>
+        </w:tc>
+        <w:tc>
+          <w:tcPr>
+            <w:tcW w:type="dxa" w:w="1994"/>
+          </w:tcPr>
+          <w:p>
+            <w:pPr>
+              <w:spacing w:after="0"/>
+              <w:jc w:val="right"/>
+            </w:pPr>
+            <w:r>
+              <w:rPr>
+                <w:sz w:val="17"/>
+              </w:rPr>
+              <w:t>0.008</w:t>
+            </w:r>
+          </w:p>
+        </w:tc>
+      </w:tr>
+      <w:tr>
+        <w:tc>
+          <w:tcPr>
+            <w:tcW w:type="dxa" w:w="1994"/>
+          </w:tcPr>
+          <w:p>
+            <w:pPr>
+              <w:spacing w:after="0"/>
+            </w:pPr>
+            <w:r>
+              <w:rPr>
+                <w:sz w:val="17"/>
+              </w:rPr>
+              <w:t>direct AST</w:t>
+            </w:r>
+          </w:p>
+        </w:tc>
+        <w:tc>
+          <w:tcPr>
+            <w:tcW w:type="dxa" w:w="1994"/>
+          </w:tcPr>
+          <w:p>
+            <w:pPr>
+              <w:spacing w:after="0"/>
+              <w:jc w:val="right"/>
+            </w:pPr>
+            <w:r>
+              <w:rPr>
+                <w:sz w:val="17"/>
+              </w:rPr>
+              <w:t>0.023</w:t>
+            </w:r>
+          </w:p>
+        </w:tc>
+        <w:tc>
+          <w:tcPr>
+            <w:tcW w:type="dxa" w:w="1994"/>
+          </w:tcPr>
+          <w:p>
+            <w:pPr>
+              <w:spacing w:after="0"/>
+              <w:jc w:val="right"/>
+            </w:pPr>
+            <w:r>
+              <w:rPr>
+                <w:sz w:val="17"/>
+              </w:rPr>
+              <w:t>0.050</w:t>
+            </w:r>
+          </w:p>
+        </w:tc>
+        <w:tc>
+          <w:tcPr>
+            <w:tcW w:type="dxa" w:w="1994"/>
+          </w:tcPr>
+          <w:p>
+            <w:pPr>
+              <w:spacing w:after="0"/>
+              <w:jc w:val="right"/>
+            </w:pPr>
+            <w:r>
+              <w:rPr>
+                <w:sz w:val="17"/>
+              </w:rPr>
+              <w:t>0.018</w:t>
+            </w:r>
+          </w:p>
+        </w:tc>
+        <w:tc>
+          <w:tcPr>
+            <w:tcW w:type="dxa" w:w="1994"/>
+          </w:tcPr>
+          <w:p>
+            <w:pPr>
+              <w:spacing w:after="0"/>
+              <w:jc w:val="right"/>
+            </w:pPr>
+            <w:r>
+              <w:rPr>
+                <w:sz w:val="17"/>
+              </w:rPr>
+              <w:t>0.001</w:t>
+            </w:r>
+          </w:p>
+        </w:tc>
+      </w:tr>
+      <w:tr>
+        <w:tc>
+          <w:tcPr>
+            <w:tcW w:type="dxa" w:w="1994"/>
+          </w:tcPr>
+          <w:p>
+            <w:pPr>
+              <w:spacing w:after="0"/>
+            </w:pPr>
+            <w:r>
+              <w:rPr>
+                <w:sz w:val="17"/>
+              </w:rPr>
+              <w:t>PCA-8 control</w:t>
+            </w:r>
+          </w:p>
+        </w:tc>
+        <w:tc>
+          <w:tcPr>
+            <w:tcW w:type="dxa" w:w="1994"/>
+          </w:tcPr>
+          <w:p>
+            <w:pPr>
+              <w:spacing w:after="0"/>
+              <w:jc w:val="right"/>
+            </w:pPr>
+            <w:r>
+              <w:rPr>
+                <w:sz w:val="17"/>
+              </w:rPr>
+              <w:t>0.015</w:t>
+            </w:r>
+          </w:p>
+        </w:tc>
+        <w:tc>
+          <w:tcPr>
+            <w:tcW w:type="dxa" w:w="1994"/>
+          </w:tcPr>
+          <w:p>
+            <w:pPr>
+              <w:spacing w:after="0"/>
+              <w:jc w:val="right"/>
+            </w:pPr>
+            <w:r>
+              <w:rPr>
+                <w:sz w:val="17"/>
+              </w:rPr>
+              <w:t>0.061</w:t>
+            </w:r>
+          </w:p>
+        </w:tc>
+        <w:tc>
+          <w:tcPr>
+            <w:tcW w:type="dxa" w:w="1994"/>
+          </w:tcPr>
+          <w:p>
+            <w:pPr>
+              <w:spacing w:after="0"/>
+              <w:jc w:val="right"/>
+            </w:pPr>
+            <w:r>
+              <w:rPr>
+                <w:sz w:val="17"/>
+              </w:rPr>
+              <w:t>0.026</w:t>
+            </w:r>
+          </w:p>
+        </w:tc>
+        <w:tc>
+          <w:tcPr>
+            <w:tcW w:type="dxa" w:w="1994"/>
+          </w:tcPr>
+          <w:p>
+            <w:pPr>
+              <w:spacing w:after="0"/>
+              <w:jc w:val="right"/>
+            </w:pPr>
+            <w:r>
+              <w:rPr>
+                <w:sz w:val="17"/>
+              </w:rPr>
+              <w:t>0.004</w:t>
+            </w:r>
+          </w:p>
+        </w:tc>
+      </w:tr>
+    </w:tbl>
+    <w:p>
+      <w:pPr>
+        <w:spacing w:after="40"/>
+      </w:pPr>
+    </w:p>
+    <w:p>
+      <w:r>
+        <w:t>How to read it, for the emotion route (film level 0.469, clip level 0.417):</w:t>
       </w:r>
     </w:p>
     <w:p>
@@ -5188,7 +5768,7 @@
         <w:t>Splits</w:t>
       </w:r>
       <w:r>
-        <w:t>: the 10 repeats lie between 0.396 and 0.428 (SD 0.011, about 3 % of the score). The emotion route is the steadiest of the four audio routes; direct VGGish varies twice as much.</w:t>
+        <w:t>: the 10 repeats lie between 0.423 and 0.513 (SD 0.026, about 6 % of the score). Film-level SDs are about two to three times the clip-level ones (1.9 to 2.8), because each genre's F1 now rests on a few films (Comedy 4, Horror 5): one film more or less moves it a lot. The emotion route is still the steadiest of the four audio routes; direct VGGish varies twice as much (0.055; its repeats span 0.281 to 0.442).</w:t>
       </w:r>
     </w:p>
     <w:p>
@@ -5203,7 +5783,7 @@
         <w:t>Single folds</w:t>
       </w:r>
       <w:r>
-        <w:t>: SD 0.054, five times the repeat SD. One fold alone could not separate two routes 0.04 apart; ten pooled repeats can.</w:t>
+        <w:t xml:space="preserve"> (clip level only): SD 0.054, five times the clip-level repeat SD. One fold alone could not separate two routes 0.04 apart; ten pooled repeats can.</w:t>
       </w:r>
     </w:p>
     <w:p>
@@ -5218,7 +5798,7 @@
         <w:t>Which films</w:t>
       </w:r>
       <w:r>
-        <w:t>: SE 0.024, the largest of the meaningful sources. Only more films can reduce it. This is why the significance tests resample films.</w:t>
+        <w:t>: SE 0.035 at film level (0.024 over clips). Only more films can reduce it, which is why the significance tests resample films.</w:t>
       </w:r>
     </w:p>
     <w:p>
@@ -5233,7 +5813,7 @@
         <w:t>Seeds</w:t>
       </w:r>
       <w:r>
-        <w:t xml:space="preserve">: the mean moves by 0.003 (0.410 to 0.417 across the five seeds). The lead over direct VGGish is positive under </w:t>
+        <w:t xml:space="preserve">: the mean moves by 0.010 (0.463 to 0.489 across the five seeds). The lead over direct VGGish is positive under </w:t>
       </w:r>
       <w:r>
         <w:rPr>
@@ -5242,7 +5822,7 @@
         <w:t>every</w:t>
       </w:r>
       <w:r>
-        <w:t xml:space="preserve"> seed (+0.037 to +0.059), as are the leads over AST and PCA-8. For contrast, the PCA-8-vs-VGGish difference changes sign between seeds (−0.005 to +0.012), which is what "no effect" looks like.</w:t>
+        <w:t xml:space="preserve"> seed (+0.093 to +0.128), as are the leads over AST (+0.140 to +0.173) and PCA-8 (+0.040 to +0.070). Unlike over clips, where the PCA-8-vs-VGGish difference changed sign between seeds (−0.005 to +0.012), at film level PCA-8 is ahead of VGGish under every seed (+0.033 to +0.059): compression alone helps a little per film.</w:t>
       </w:r>
     </w:p>
     <w:p>
@@ -5250,10 +5830,10 @@
         <w:rPr>
           <w:b/>
         </w:rPr>
-        <w:t>Ordering of the sources:</w:t>
+        <w:t>Ordering of the sources at film level:</w:t>
       </w:r>
       <w:r>
-        <w:t xml:space="preserve"> seed (≤ 0.008) &lt; split (≤ 0.023) &lt; films (0.018–0.027) &lt; single fold (≈ 0.055). The result is stable against everything the code controls. What remains uncertain is the dataset itself.</w:t>
+        <w:t xml:space="preserve"> seed (0.008–0.015) &lt; split (0.017–0.055) ≈ films (0.027–0.044). For the emotion route, PCA-8 and the ratings the film sample is the larger source, as over clips. For the two direct embeddings the split now varies more. The result is stable against everything the code controls (the seed); what remains uncertain is the dataset itself.</w:t>
       </w:r>
     </w:p>
     <w:p>
@@ -5264,7 +5844,7 @@
         <w:t>Reproducibility check.</w:t>
       </w:r>
       <w:r>
-        <w:t xml:space="preserve"> Under seed 42 the new script reproduces the per-repeat scores of the main analysis (</w:t>
+        <w:t xml:space="preserve"> Under seed 42 the film-level script reproduces every clip-level per-repeat score of the main analysis (</w:t>
       </w:r>
       <w:r>
         <w:rPr>
@@ -5275,7 +5855,18 @@
         <w:t>cv_corrected.json</w:t>
       </w:r>
       <w:r>
-        <w:t>) exactly, for every route.</w:t>
+        <w:t xml:space="preserve">) and the clip-level seed means of </w:t>
+      </w:r>
+      <w:r>
+        <w:rPr>
+          <w:rFonts w:ascii="Consolas" w:hAnsi="Consolas"/>
+          <w:color w:val="404040"/>
+          <w:sz w:val="18"/>
+        </w:rPr>
+        <w:t>metrics_stability.json</w:t>
+      </w:r>
+      <w:r>
+        <w:t xml:space="preserve"> exactly (107 numbers).</w:t>
       </w:r>
     </w:p>
     <w:p>
@@ -5291,7 +5882,7 @@
         <w:t>figures/stability_repeats.pdf</w:t>
       </w:r>
       <w:r>
-        <w:t xml:space="preserve"> (left: the 10 repeats per route; right: the mean under each of the five seeds).</w:t>
+        <w:t>, film level (dots and boxes: the 10 repeats per route under seed 42; black dashes: the 10-repeat mean under each of the five seeds).</w:t>
       </w:r>
     </w:p>
     <w:p>
@@ -6213,7 +6804,20 @@
               <w:rPr>
                 <w:sz w:val="17"/>
               </w:rPr>
-              <w:t>every representation and route on 5 genres, with 95 % intervals and both chance levels</w:t>
+              <w:t xml:space="preserve">every representation and route on 5 genres, </w:t>
+            </w:r>
+            <w:r>
+              <w:rPr>
+                <w:b/>
+                <w:sz w:val="17"/>
+              </w:rPr>
+              <w:t>film level</w:t>
+            </w:r>
+            <w:r>
+              <w:rPr>
+                <w:sz w:val="17"/>
+              </w:rPr>
+              <w:t xml:space="preserve"> with 95 % intervals, the clip-level score as a hollow marker, and both chance levels</w:t>
             </w:r>
           </w:p>
         </w:tc>
@@ -6249,7 +6853,7 @@
               <w:rPr>
                 <w:sz w:val="17"/>
               </w:rPr>
-              <w:t>the 10 repeats per route, and the mean under each of 5 seeds</w:t>
+              <w:t>the 10 repeats per route, and the mean under each of 5 seeds (film level)</w:t>
             </w:r>
           </w:p>
         </w:tc>
@@ -6285,7 +6889,7 @@
               <w:rPr>
                 <w:sz w:val="17"/>
               </w:rPr>
-              <w:t>the routes under 7 metrics, as distance above random guessing</w:t>
+              <w:t>the routes under 7 metrics, as distance above random guessing (film-level headline first, the rest per clip)</w:t>
             </w:r>
           </w:p>
         </w:tc>
@@ -6357,7 +6961,7 @@
               <w:rPr>
                 <w:sz w:val="17"/>
               </w:rPr>
-              <w:t>removing each emotion: difference to all eight, with intervals</w:t>
+              <w:t>removing each emotion: difference to all eight, with intervals (film level)</w:t>
             </w:r>
           </w:p>
         </w:tc>
@@ -6465,7 +7069,7 @@
               <w:rPr>
                 <w:sz w:val="17"/>
               </w:rPr>
-              <w:t>both transfer directions and the pooled design</w:t>
+              <w:t>both transfer directions and the pooled design (film level)</w:t>
             </w:r>
           </w:p>
         </w:tc>
@@ -6882,7 +7486,7 @@
     </w:p>
     <w:p>
       <w:r>
-        <w:t>Once both datasets are in training, the two routes tie: the emotion advantage is a generalisation advantage.</w:t>
+        <w:t>Once both datasets are in training, the two routes tie. (Scored per film, section 10, the pooled design is still a tie.)</w:t>
       </w:r>
     </w:p>
     <w:p>
@@ -7032,7 +7636,7 @@
         <w:t>Is the emotion route better in-domain or not?</w:t>
       </w:r>
       <w:r>
-        <w:t xml:space="preserve"> At the standard decision threshold, yes: ahead of every direct representation in all 10 repeats and all 5 seeds, significant under the film bootstrap (p = 0.042) and borderline under Nadeau–Bengio (p = 0.151). With per-genre thresholds tuned on the training data, the routes converge and the lead is not significant. So in-domain it "loses nothing and is ahead at the default operating point", not "better under every metric".</w:t>
+        <w:t xml:space="preserve"> Scored per film (the headline), yes against direct audio: 0.469 vs 0.375 for VGGish (+0.095, p = 0.047), ahead in all 10 repeats and all 5 seeds. It is not significantly ahead of MusiCNN (p = 0.079) or the PCA-8 control (p = 0.326), and PCA-8 itself beats VGGish under every seed, so part of the gain is compression. Over clips the lead is +0.040, significant under the film bootstrap (p = 0.042) and borderline under Nadeau–Bengio (p = 0.151). With per-genre thresholds tuned on the training data, the routes converge over clips and the lead is not significant. So in-domain it "loses nothing and is ahead at the default operating point", not "better under every metric".</w:t>
       </w:r>
     </w:p>
     <w:p>
@@ -7043,7 +7647,7 @@
         <w:t>Then what is left of the main claim?</w:t>
       </w:r>
       <w:r>
-        <w:t xml:space="preserve"> The cross-dataset result: 0.511 vs 0.407 (p = 0.018) from Eerola to Blockbuster, the reverse direction agreeing (p &lt; 0.001), a tie once both datasets are in training (p = 0.850), and interpretable predictions whose emotional signatures replicate on a second dataset (r = 0.836). The advantage is a generalisation advantage; the thesis says so.</w:t>
+        <w:t xml:space="preserve"> The emotion route is clearly ahead where the genre classifier is trained on the 41 Eerola films: in-domain (5 and 8 genres) and from Eerola to Blockbuster (0.511 vs 0.407, p = 0.018). It is level where the classifier is trained on the 110 Blockbuster films or on both datasets. The reverse direction agrees in sign (+0.077 per film) but is not significant (p = 0.127). And its predictions are interpretable: the emotional signatures replicate on a second dataset (r = 0.836). The thesis calls this an advantage under scarce data and under a change of dataset (section 10).</w:t>
       </w:r>
     </w:p>
     <w:p>
@@ -7065,7 +7669,7 @@
         <w:t>How stable are the numbers?</w:t>
       </w:r>
       <w:r>
-        <w:t xml:space="preserve"> Very: the 10-repeat mean moves by at most 0.008 between seeds, and the emotion lead over VGGish stays between +0.037 and +0.059 under every seed. The main uncertainty is which 41 films the dataset contains (bootstrap SE about 0.02).</w:t>
+        <w:t xml:space="preserve"> Very. Per film, the 10-repeat mean moves by at most 0.015 between seeds, and the emotion lead over VGGish stays between +0.093 and +0.128 under every seed. Over clips the figures are 0.008 and +0.037 to +0.059. The main uncertainty is which 41 films the dataset contains (bootstrap SE about 0.02).</w:t>
       </w:r>
     </w:p>
     <w:p>

</xml_diff>

<commit_message>
current_state: supervisor's notes of 8 Oct verbatim; section 10 explains each addition for the author
Co-Authored-By: Claude Opus 5.5 <noreply@anthropic.com>
</commit_message>
<xml_diff>
--- a/docs/current_state.docx
+++ b/docs/current_state.docx
@@ -74,6 +74,47 @@
       </w:pPr>
       <w:r>
         <w:t>1. Your notes from the meeting</w:t>
+      </w:r>
+    </w:p>
+    <w:p>
+      <w:r>
+        <w:t>Your four notes from 8 October, as written down after the meeting:</w:t>
+      </w:r>
+    </w:p>
+    <w:p>
+      <w:pPr>
+        <w:spacing w:after="40"/>
+        <w:ind w:left="510" w:hanging="340"/>
+      </w:pPr>
+      <w:r>
+        <w:t>1. "Blockbuster cross validation (bar chart is ok, but with SD)"</w:t>
+      </w:r>
+    </w:p>
+    <w:p>
+      <w:pPr>
+        <w:spacing w:after="40"/>
+        <w:ind w:left="510" w:hanging="340"/>
+      </w:pPr>
+      <w:r>
+        <w:t>2. "Common films between Eerola and Blockbuster should be considered in the Evaluation part (leakage)"</w:t>
+      </w:r>
+    </w:p>
+    <w:p>
+      <w:pPr>
+        <w:spacing w:after="40"/>
+        <w:ind w:left="510" w:hanging="340"/>
+      </w:pPr>
+      <w:r>
+        <w:t>3. "Each genre: F1-score, precision and recall; check the highest model for each genre and maybe make a diagram out of the results"</w:t>
+      </w:r>
+    </w:p>
+    <w:p>
+      <w:pPr>
+        <w:spacing w:after="40"/>
+        <w:ind w:left="510" w:hanging="340"/>
+      </w:pPr>
+      <w:r>
+        <w:t>4. "More focus in the Evaluation part on only a couple of results, so the reader is not distracted; be more precise in the Discussion and the whole thesis"</w:t>
       </w:r>
     </w:p>
     <w:tbl>
@@ -2738,6 +2779,671 @@
         <w:pStyle w:val="Heading1"/>
       </w:pPr>
       <w:r>
+        <w:t>10. For the author: what was added, and how to explain it</w:t>
+      </w:r>
+    </w:p>
+    <w:p>
+      <w:r>
+        <w:rPr>
+          <w:i/>
+        </w:rPr>
+        <w:t>This section is your preparation, not part of the briefing.</w:t>
+      </w:r>
+      <w:r>
+        <w:t xml:space="preserve"> For every addition since the fifth meeting: where it is in the thesis, how it was computed, what to say, and where the weak spot is.</w:t>
+      </w:r>
+    </w:p>
+    <w:p>
+      <w:pPr>
+        <w:pStyle w:val="Heading2"/>
+      </w:pPr>
+      <w:r>
+        <w:t>10.1 The duplicate film (the change that moved every number)</w:t>
+      </w:r>
+    </w:p>
+    <w:p>
+      <w:pPr>
+        <w:pStyle w:val="ListBullet"/>
+        <w:spacing w:after="40"/>
+      </w:pPr>
+      <w:r>
+        <w:rPr>
+          <w:b/>
+        </w:rPr>
+        <w:t>Where:</w:t>
+      </w:r>
+      <w:r>
+        <w:t xml:space="preserve"> Chapter 5, Section 5.6 (paragraph "No film occurs in both datasets", last sentences); log section 24; </w:t>
+      </w:r>
+      <w:r>
+        <w:rPr>
+          <w:rFonts w:ascii="Consolas" w:hAnsi="Consolas"/>
+          <w:color w:val="404040"/>
+          <w:sz w:val="18"/>
+        </w:rPr>
+        <w:t>src/config.py</w:t>
+      </w:r>
+      <w:r>
+        <w:t xml:space="preserve"> (</w:t>
+      </w:r>
+      <w:r>
+        <w:rPr>
+          <w:rFonts w:ascii="Consolas" w:hAnsi="Consolas"/>
+          <w:color w:val="404040"/>
+          <w:sz w:val="18"/>
+        </w:rPr>
+        <w:t>SOUNDTRACK_NAME_FIXES</w:t>
+      </w:r>
+      <w:r>
+        <w:t xml:space="preserve">), applied in </w:t>
+      </w:r>
+      <w:r>
+        <w:rPr>
+          <w:rFonts w:ascii="Consolas" w:hAnsi="Consolas"/>
+          <w:color w:val="404040"/>
+          <w:sz w:val="18"/>
+        </w:rPr>
+        <w:t>src/features/loader.py</w:t>
+      </w:r>
+      <w:r>
+        <w:t>.</w:t>
+      </w:r>
+    </w:p>
+    <w:p>
+      <w:pPr>
+        <w:pStyle w:val="ListBullet"/>
+        <w:spacing w:after="40"/>
+      </w:pPr>
+      <w:r>
+        <w:rPr>
+          <w:b/>
+        </w:rPr>
+        <w:t>What happened:</w:t>
+      </w:r>
+      <w:r>
+        <w:t xml:space="preserve"> cross-validation groups clips by the soundtrack name so that a film is never in training and test at once. Clip 256 had the typo "The Portait of a Lady", so the grouping saw two films. That one clip could be tested while the film's other six clips were in training.</w:t>
+      </w:r>
+    </w:p>
+    <w:p>
+      <w:pPr>
+        <w:pStyle w:val="ListBullet"/>
+        <w:spacing w:after="40"/>
+      </w:pPr>
+      <w:r>
+        <w:rPr>
+          <w:b/>
+        </w:rPr>
+        <w:t>How it was fixed:</w:t>
+      </w:r>
+      <w:r>
+        <w:t xml:space="preserve"> the loader maps the misspelt name to the correct one before anything else runs. All 16 film-grouped experiments were then re-run in their dependency order (about two hours). Each script first reproduces the stored numbers of the one before it, so the changes come from the merge alone, not from a code change.</w:t>
+      </w:r>
+    </w:p>
+    <w:p>
+      <w:pPr>
+        <w:pStyle w:val="ListBullet"/>
+        <w:spacing w:after="40"/>
+      </w:pPr>
+      <w:r>
+        <w:rPr>
+          <w:b/>
+        </w:rPr>
+        <w:t>What to say:</w:t>
+      </w:r>
+      <w:r>
+        <w:t xml:space="preserve"> "While checking the leakage between the datasets I found a leak inside Eerola, fixed it and re-ran everything. The numbers moved by about the size of the split noise; the conclusions changed in one place: the in-domain lead over VGGish went from p = 0.047 to p = 0.052."</w:t>
+      </w:r>
+    </w:p>
+    <w:p>
+      <w:pPr>
+        <w:pStyle w:val="ListBullet"/>
+        <w:spacing w:after="40"/>
+      </w:pPr>
+      <w:r>
+        <w:rPr>
+          <w:b/>
+        </w:rPr>
+        <w:t>Weak spot:</w:t>
+      </w:r>
+      <w:r>
+        <w:t xml:space="preserve"> the earlier p = 0.047 was "significant", the new p = 0.052 is not. Do not round it; the thesis says it "just misses".</w:t>
+      </w:r>
+    </w:p>
+    <w:p>
+      <w:pPr>
+        <w:pStyle w:val="Heading2"/>
+      </w:pPr>
+      <w:r>
+        <w:t>10.2 Note 1: the bar charts with SD</w:t>
+      </w:r>
+    </w:p>
+    <w:p>
+      <w:pPr>
+        <w:pStyle w:val="ListBullet"/>
+        <w:spacing w:after="40"/>
+      </w:pPr>
+      <w:r>
+        <w:rPr>
+          <w:b/>
+        </w:rPr>
+        <w:t>Where:</w:t>
+      </w:r>
+      <w:r>
+        <w:t xml:space="preserve"> Figure </w:t>
+      </w:r>
+      <w:r>
+        <w:rPr>
+          <w:rFonts w:ascii="Consolas" w:hAnsi="Consolas"/>
+          <w:color w:val="404040"/>
+          <w:sz w:val="18"/>
+        </w:rPr>
+        <w:t>blockbuster_cv</w:t>
+      </w:r>
+      <w:r>
+        <w:t xml:space="preserve"> (Section 5.6.1) and Figure </w:t>
+      </w:r>
+      <w:r>
+        <w:rPr>
+          <w:rFonts w:ascii="Consolas" w:hAnsi="Consolas"/>
+          <w:color w:val="404040"/>
+          <w:sz w:val="18"/>
+        </w:rPr>
+        <w:t>cross_dataset</w:t>
+      </w:r>
+      <w:r>
+        <w:t xml:space="preserve"> (Section 5.6.3), now with error bars; scripts </w:t>
+      </w:r>
+      <w:r>
+        <w:rPr>
+          <w:rFonts w:ascii="Consolas" w:hAnsi="Consolas"/>
+          <w:color w:val="404040"/>
+          <w:sz w:val="18"/>
+        </w:rPr>
+        <w:t>experiments/make_figures.py</w:t>
+      </w:r>
+      <w:r>
+        <w:t>.</w:t>
+      </w:r>
+    </w:p>
+    <w:p>
+      <w:pPr>
+        <w:pStyle w:val="ListBullet"/>
+        <w:spacing w:after="40"/>
+      </w:pPr>
+      <w:r>
+        <w:rPr>
+          <w:b/>
+        </w:rPr>
+        <w:t>Blockbuster in-domain chart:</w:t>
+      </w:r>
+      <w:r>
+        <w:t xml:space="preserve"> 10×5 cross-validation over the 110 films. Each bar is the mean over the 50 folds; the </w:t>
+      </w:r>
+      <w:r>
+        <w:rPr>
+          <w:b/>
+        </w:rPr>
+        <w:t>error bar is the SD of the ten repeat means</w:t>
+      </w:r>
+      <w:r>
+        <w:t>, i.e. how much the result moves when the films are shuffled into different folds. The p-values beside it are Nadeau–Bengio (there are folds here, so that test works).</w:t>
+      </w:r>
+    </w:p>
+    <w:p>
+      <w:pPr>
+        <w:pStyle w:val="ListBullet"/>
+        <w:spacing w:after="40"/>
+      </w:pPr>
+      <w:r>
+        <w:rPr>
+          <w:b/>
+        </w:rPr>
+        <w:t>Cross-dataset chart:</w:t>
+      </w:r>
+      <w:r>
+        <w:t xml:space="preserve"> a transfer direction is one fixed train–test split, so there are no repeats to take an SD over. Its error bar is the </w:t>
+      </w:r>
+      <w:r>
+        <w:rPr>
+          <w:b/>
+        </w:rPr>
+        <w:t>bootstrap SD over the test films</w:t>
+      </w:r>
+      <w:r>
+        <w:t xml:space="preserve"> (draw the test films with replacement 2000 times, rescore, take the SD). For the pooled design, which is cross-validated, it is again the SD of the repeat means.</w:t>
+      </w:r>
+    </w:p>
+    <w:p>
+      <w:pPr>
+        <w:pStyle w:val="ListBullet"/>
+        <w:spacing w:after="40"/>
+      </w:pPr>
+      <w:r>
+        <w:rPr>
+          <w:b/>
+        </w:rPr>
+        <w:t>What to say:</w:t>
+      </w:r>
+      <w:r>
+        <w:t xml:space="preserve"> "The bars show that a single transfer split can move by ±0.03 to ±0.07, which is why I compare the routes with a paired bootstrap rather than by whether bars overlap."</w:t>
+      </w:r>
+    </w:p>
+    <w:p>
+      <w:pPr>
+        <w:pStyle w:val="ListBullet"/>
+        <w:spacing w:after="40"/>
+      </w:pPr>
+      <w:r>
+        <w:rPr>
+          <w:b/>
+        </w:rPr>
+        <w:t>Weak spot:</w:t>
+      </w:r>
+      <w:r>
+        <w:t xml:space="preserve"> the two error bars measure different things (fold shuffling vs which films are sampled). The figure text says which is which; if asked, say that.</w:t>
+      </w:r>
+    </w:p>
+    <w:p>
+      <w:pPr>
+        <w:pStyle w:val="Heading2"/>
+      </w:pPr>
+      <w:r>
+        <w:t>10.3 Note 2: the leakage check</w:t>
+      </w:r>
+    </w:p>
+    <w:p>
+      <w:pPr>
+        <w:pStyle w:val="ListBullet"/>
+        <w:spacing w:after="40"/>
+      </w:pPr>
+      <w:r>
+        <w:rPr>
+          <w:b/>
+        </w:rPr>
+        <w:t>Where:</w:t>
+      </w:r>
+      <w:r>
+        <w:t xml:space="preserve"> Chapter 5, Section 5.6, paragraph "No film occurs in both datasets".</w:t>
+      </w:r>
+    </w:p>
+    <w:p>
+      <w:pPr>
+        <w:pStyle w:val="ListBullet"/>
+        <w:spacing w:after="40"/>
+      </w:pPr>
+      <w:r>
+        <w:rPr>
+          <w:b/>
+        </w:rPr>
+        <w:t>How:</w:t>
+      </w:r>
+      <w:r>
+        <w:t xml:space="preserve"> every Eerola film's IMDb id was compared with the 110 Blockbuster ids, and the titles were compared exactly and loosely (lower case, punctuation removed). Nothing matched. The release years explain why: Eerola before 2011, Blockbuster 2014–2019.</w:t>
+      </w:r>
+    </w:p>
+    <w:p>
+      <w:pPr>
+        <w:pStyle w:val="ListBullet"/>
+        <w:spacing w:after="40"/>
+      </w:pPr>
+      <w:r>
+        <w:rPr>
+          <w:b/>
+        </w:rPr>
+        <w:t>What to say:</w:t>
+      </w:r>
+      <w:r>
+        <w:t xml:space="preserve"> "No film is in both datasets, so the transfer result cannot come from a shared film. The datasets do share composers, e.g. Danny Elfman (</w:t>
+      </w:r>
+      <w:r>
+        <w:rPr>
+          <w:i/>
+        </w:rPr>
+        <w:t>Batman</w:t>
+      </w:r>
+      <w:r>
+        <w:t xml:space="preserve"> / </w:t>
+      </w:r>
+      <w:r>
+        <w:rPr>
+          <w:i/>
+        </w:rPr>
+        <w:t>Justice League</w:t>
+      </w:r>
+      <w:r>
+        <w:t>), which is a possible stylistic overlap; I name it as a limitation."</w:t>
+      </w:r>
+    </w:p>
+    <w:p>
+      <w:pPr>
+        <w:pStyle w:val="Heading2"/>
+      </w:pPr>
+      <w:r>
+        <w:t>10.4 Note 3: precision, recall and F1 per genre</w:t>
+      </w:r>
+    </w:p>
+    <w:p>
+      <w:pPr>
+        <w:pStyle w:val="ListBullet"/>
+        <w:spacing w:after="40"/>
+      </w:pPr>
+      <w:r>
+        <w:rPr>
+          <w:b/>
+        </w:rPr>
+        <w:t>Where:</w:t>
+      </w:r>
+      <w:r>
+        <w:t xml:space="preserve"> Chapter 5, Section 5.4: Figure </w:t>
+      </w:r>
+      <w:r>
+        <w:rPr>
+          <w:rFonts w:ascii="Consolas" w:hAnsi="Consolas"/>
+          <w:color w:val="404040"/>
+          <w:sz w:val="18"/>
+        </w:rPr>
+        <w:t>per_genre</w:t>
+      </w:r>
+      <w:r>
+        <w:t xml:space="preserve"> (heatmap) and Table </w:t>
+      </w:r>
+      <w:r>
+        <w:rPr>
+          <w:rFonts w:ascii="Consolas" w:hAnsi="Consolas"/>
+          <w:color w:val="404040"/>
+          <w:sz w:val="18"/>
+        </w:rPr>
+        <w:t>per_genre</w:t>
+      </w:r>
+      <w:r>
+        <w:t xml:space="preserve">. Numbers in </w:t>
+      </w:r>
+      <w:r>
+        <w:rPr>
+          <w:rFonts w:ascii="Consolas" w:hAnsi="Consolas"/>
+          <w:color w:val="404040"/>
+          <w:sz w:val="18"/>
+        </w:rPr>
+        <w:t>results/film_level.json</w:t>
+      </w:r>
+      <w:r>
+        <w:t xml:space="preserve"> (</w:t>
+      </w:r>
+      <w:r>
+        <w:rPr>
+          <w:rFonts w:ascii="Consolas" w:hAnsi="Consolas"/>
+          <w:color w:val="404040"/>
+          <w:sz w:val="18"/>
+        </w:rPr>
+        <w:t>per_genre_precision</w:t>
+      </w:r>
+      <w:r>
+        <w:t xml:space="preserve">, </w:t>
+      </w:r>
+      <w:r>
+        <w:rPr>
+          <w:rFonts w:ascii="Consolas" w:hAnsi="Consolas"/>
+          <w:color w:val="404040"/>
+          <w:sz w:val="18"/>
+        </w:rPr>
+        <w:t>per_genre_recall</w:t>
+      </w:r>
+      <w:r>
+        <w:t xml:space="preserve">, </w:t>
+      </w:r>
+      <w:r>
+        <w:rPr>
+          <w:rFonts w:ascii="Consolas" w:hAnsi="Consolas"/>
+          <w:color w:val="404040"/>
+          <w:sz w:val="18"/>
+        </w:rPr>
+        <w:t>per_genre_f1</w:t>
+      </w:r>
+      <w:r>
+        <w:t xml:space="preserve"> for every route; </w:t>
+      </w:r>
+      <w:r>
+        <w:rPr>
+          <w:rFonts w:ascii="Consolas" w:hAnsi="Consolas"/>
+          <w:color w:val="404040"/>
+          <w:sz w:val="18"/>
+        </w:rPr>
+        <w:t>clip_per_genre_*</w:t>
+      </w:r>
+      <w:r>
+        <w:t xml:space="preserve"> for clip level).</w:t>
+      </w:r>
+    </w:p>
+    <w:p>
+      <w:pPr>
+        <w:pStyle w:val="ListBullet"/>
+        <w:spacing w:after="40"/>
+      </w:pPr>
+      <w:r>
+        <w:rPr>
+          <w:b/>
+        </w:rPr>
+        <w:t>How:</w:t>
+      </w:r>
+      <w:r>
+        <w:t xml:space="preserve"> the same predictions as the headline. Per repeat, all out-of-fold predictions are pooled, each film gets the average of its clips' probabilities, a genre is predicted at ≥ 0.5, and precision, recall and F1 are computed per genre over the 40 films. These are averaged over the ten repeats. Macro-F1 is simply the mean of the five per-genre F1s.</w:t>
+      </w:r>
+    </w:p>
+    <w:p>
+      <w:pPr>
+        <w:pStyle w:val="ListBullet"/>
+        <w:spacing w:after="40"/>
+      </w:pPr>
+      <w:r>
+        <w:rPr>
+          <w:b/>
+        </w:rPr>
+        <w:t>The heatmap:</w:t>
+      </w:r>
+      <w:r>
+        <w:t xml:space="preserve"> rows are routes, columns genres; the box marks the best route per genre among the emotion route, PCA-8 and the six direct representations (the ratings and the baseline are shown but not boxed, since they are a ceiling and a floor, not competitors).</w:t>
+      </w:r>
+    </w:p>
+    <w:p>
+      <w:pPr>
+        <w:pStyle w:val="ListBullet"/>
+        <w:spacing w:after="40"/>
+      </w:pPr>
+      <w:r>
+        <w:rPr>
+          <w:b/>
+        </w:rPr>
+        <w:t>What to say:</w:t>
+      </w:r>
+      <w:r>
+        <w:t xml:space="preserve"> "The emotion route is the best route for Action, Crime and Comedy. Its advantage is mainly recall: it finds the rare genres (Comedy recall 0.78 vs 0.12), at the price of more false positives. Horror is the exception: although fear defines it, the emotion route predicts Horror for too many films."</w:t>
+      </w:r>
+    </w:p>
+    <w:p>
+      <w:pPr>
+        <w:pStyle w:val="ListBullet"/>
+        <w:spacing w:after="40"/>
+      </w:pPr>
+      <w:r>
+        <w:rPr>
+          <w:b/>
+        </w:rPr>
+        <w:t>Weak spot:</w:t>
+      </w:r>
+      <w:r>
+        <w:t xml:space="preserve"> Comedy has 4 films and Horror 5. One film more or less changes their F1 by about 0.2, so the per-genre comparison is a description, not a test. No p-values are given per genre on purpose.</w:t>
+      </w:r>
+    </w:p>
+    <w:p>
+      <w:pPr>
+        <w:pStyle w:val="Heading2"/>
+      </w:pPr>
+      <w:r>
+        <w:t>10.5 Note 4: a focused Evaluation and Discussion</w:t>
+      </w:r>
+    </w:p>
+    <w:p>
+      <w:pPr>
+        <w:pStyle w:val="ListBullet"/>
+        <w:spacing w:after="40"/>
+      </w:pPr>
+      <w:r>
+        <w:rPr>
+          <w:b/>
+        </w:rPr>
+        <w:t>Chapter 5 now has seven sections:</w:t>
+      </w:r>
+      <w:r>
+        <w:t xml:space="preserve"> 5.1 Stage 1 → 5.2 RQ1 → 5.3 emotion vs direct audio (one table, four comparisons) → 5.4 per genre → 5.5 emotional signatures → 5.6 transfer (Blockbuster in-domain, leakage, zero-shot, three designs) → 5.7 summary.</w:t>
+      </w:r>
+    </w:p>
+    <w:p>
+      <w:pPr>
+        <w:pStyle w:val="ListBullet"/>
+        <w:spacing w:after="40"/>
+      </w:pPr>
+      <w:r>
+        <w:rPr>
+          <w:b/>
+        </w:rPr>
+        <w:t>New Appendix A</w:t>
+      </w:r>
+      <w:r>
+        <w:t xml:space="preserve"> (</w:t>
+      </w:r>
+      <w:r>
+        <w:rPr>
+          <w:rFonts w:ascii="Consolas" w:hAnsi="Consolas"/>
+          <w:color w:val="404040"/>
+          <w:sz w:val="18"/>
+        </w:rPr>
+        <w:t>appendix/supplementary.tex</w:t>
+      </w:r>
+      <w:r>
+        <w:t>) holds everything that checks a result without changing it: A.1 all paired comparisons and why Nadeau–Bengio stays borderline, A.2 choice of metric and stability, A.3 the emotion ablation, A.4 the waveform model, A.5 all eight genres, A.6 the reproduction of Ma et al. and cue-level prediction, A.7 error analysis. The main text points to each with one sentence.</w:t>
+      </w:r>
+    </w:p>
+    <w:p>
+      <w:pPr>
+        <w:pStyle w:val="ListBullet"/>
+        <w:spacing w:after="40"/>
+      </w:pPr>
+      <w:r>
+        <w:rPr>
+          <w:b/>
+        </w:rPr>
+        <w:t>Chapter 6 (Discussion)</w:t>
+      </w:r>
+      <w:r>
+        <w:t xml:space="preserve"> is built around one table of all settings. 6.1 interprets the main result, 6.2 explains why the bottleneck helps where it does (meaning vs compression, little data, domain shift), 6.3 limitations, 6.4 prior work.</w:t>
+      </w:r>
+    </w:p>
+    <w:p>
+      <w:pPr>
+        <w:pStyle w:val="ListBullet"/>
+        <w:spacing w:after="40"/>
+      </w:pPr>
+      <w:r>
+        <w:rPr>
+          <w:b/>
+        </w:rPr>
+        <w:t>What to say:</w:t>
+      </w:r>
+      <w:r>
+        <w:t xml:space="preserve"> "The main text now answers the research questions and nothing else; everything that only confirms a result is in the appendix."</w:t>
+      </w:r>
+    </w:p>
+    <w:p>
+      <w:pPr>
+        <w:pStyle w:val="Heading2"/>
+      </w:pPr>
+      <w:r>
+        <w:t>10.6 Background you may be asked about</w:t>
+      </w:r>
+    </w:p>
+    <w:p>
+      <w:pPr>
+        <w:pStyle w:val="ListBullet"/>
+        <w:spacing w:after="40"/>
+      </w:pPr>
+      <w:r>
+        <w:rPr>
+          <w:b/>
+        </w:rPr>
+        <w:t>How Stage 1 is evaluated.</w:t>
+      </w:r>
+      <w:r>
+        <w:t xml:space="preserve"> A random forest predicts each of the eight emotion ratings from an audio embedding. It is scored by R² on out-of-fold predictions of five-fold cross-validation grouped by film, over all 360 rated clips, and averaged over the emotions. R² = 0 means "as good as always predicting the mean rating"; the best embeddings reach 0.558, i.e. 62 % of the 0.897 at which two independent listener panels agree with each other.</w:t>
+      </w:r>
+    </w:p>
+    <w:p>
+      <w:pPr>
+        <w:pStyle w:val="ListBullet"/>
+        <w:spacing w:after="40"/>
+      </w:pPr>
+      <w:r>
+        <w:rPr>
+          <w:b/>
+        </w:rPr>
+        <w:t>What "random guess" means.</w:t>
+      </w:r>
+      <w:r>
+        <w:t xml:space="preserve"> The base-rate random guess predicts each genre at random with its frequency in the training data (Drama often, Comedy rarely). It is the fair chance floor for macro-F1 (0.309 on 5 genres). The </w:t>
+      </w:r>
+      <w:r>
+        <w:rPr>
+          <w:b/>
+        </w:rPr>
+        <w:t>most-frequent</w:t>
+      </w:r>
+      <w:r>
+        <w:t xml:space="preserve"> baseline decides each genre by its majority in training, so in practice it predicts Drama for every film and never a rare genre; it scores much lower (0.168). Always name which floor you quote.</w:t>
+      </w:r>
+    </w:p>
+    <w:p>
+      <w:pPr>
+        <w:pStyle w:val="ListBullet"/>
+        <w:spacing w:after="40"/>
+      </w:pPr>
+      <w:r>
+        <w:rPr>
+          <w:b/>
+        </w:rPr>
+        <w:t>Film level vs clip level.</w:t>
+      </w:r>
+      <w:r>
+        <w:t xml:space="preserve"> Film level: average the clip probabilities of a film, then score the film once (the headline). Clip level: score every clip. Film level was chosen after the clip results were known, and the thesis says so; it turned out the </w:t>
+      </w:r>
+      <w:r>
+        <w:rPr>
+          <w:i/>
+        </w:rPr>
+        <w:t>stricter</w:t>
+      </w:r>
+      <w:r>
+        <w:t xml:space="preserve"> unit, because over clips more of the comparisons are significant.</w:t>
+      </w:r>
+    </w:p>
+    <w:p>
+      <w:pPr>
+        <w:pStyle w:val="ListBullet"/>
+        <w:spacing w:after="40"/>
+      </w:pPr>
+      <w:r>
+        <w:rPr>
+          <w:b/>
+        </w:rPr>
+        <w:t>The two tests.</w:t>
+      </w:r>
+      <w:r>
+        <w:t xml:space="preserve"> The film bootstrap resamples films (a test fold holds about 8 films, so a per-fold t-test cannot be computed per film). Nadeau–Bengio is the corrected t-test over folds, used at clip level. It also charges for which films were used for training, so it is the more conservative test. Adding repeats cannot push its p-value below a floor (p_lim); for every borderline comparison of the emotion route that floor is 0.069 to 0.200 (Appendix A.1). Only more films could make those comparisons significant.</w:t>
+      </w:r>
+    </w:p>
+    <w:p>
+      <w:pPr>
+        <w:pStyle w:val="Heading1"/>
+      </w:pPr>
+      <w:r>
         <w:t>Headline numbers as they stand</w:t>
       </w:r>
     </w:p>

</xml_diff>

<commit_message>
Hamming loss explained: breakdown by genre and error type; evaluation_metrics.md explains every metric with a paragraph for Appendix A.2
Co-Authored-By: Claude Opus 5.5 <noreply@anthropic.com>
</commit_message>
<xml_diff>
--- a/docs/current_state.docx
+++ b/docs/current_state.docx
@@ -3362,6 +3362,14 @@
       </w:r>
     </w:p>
     <w:p>
+      <w:r>
+        <w:rPr>
+          <w:i/>
+        </w:rPr>
+        <w:t>Every metric, why it was chosen and what it showed, including why the emotion route has the worst Hamming loss, is explained in `docs/evaluation_metrics.md`.</w:t>
+      </w:r>
+    </w:p>
+    <w:p>
       <w:pPr>
         <w:pStyle w:val="ListBullet"/>
         <w:spacing w:after="40"/>

</xml_diff>

<commit_message>
READMEs, verification checklist and briefing brought up to date: film-level headline and new scripts listed, post-fix numbers in the checklist, briefing section 7b on the checks of 15-20 Oct
Co-Authored-By: Claude Opus 5.5 <noreply@anthropic.com>
</commit_message>
<xml_diff>
--- a/docs/current_state.docx
+++ b/docs/current_state.docx
@@ -18,7 +18,7 @@
         <w:t>Can a soundtrack's emotion predict a film's genre?</w:t>
       </w:r>
       <w:r>
-        <w:t xml:space="preserve"> This page covers what was done after the fifth meeting: the four notes, a data error found while answering the second one, and what both changed. The briefing for the fourth meeting is archived in </w:t>
+        <w:t xml:space="preserve"> This page covers what was done after the fifth meeting: the four notes, a data error found while answering the second one, and what both changed; section 7b adds the checks of 15–20 October. The briefing for the fourth meeting is archived in </w:t>
       </w:r>
       <w:r>
         <w:rPr>
@@ -2616,6 +2616,133 @@
         <w:pStyle w:val="Heading1"/>
       </w:pPr>
       <w:r>
+        <w:t>7b. Since then (15–20 October): one new analysis, a figure check, two corrections</w:t>
+      </w:r>
+    </w:p>
+    <w:p>
+      <w:r>
+        <w:t>No result changed. The thesis on Overleaf (</w:t>
+      </w:r>
+      <w:r>
+        <w:rPr>
+          <w:rFonts w:ascii="Consolas" w:hAnsi="Consolas"/>
+          <w:color w:val="404040"/>
+          <w:sz w:val="18"/>
+        </w:rPr>
+        <w:t>4a77de0</w:t>
+      </w:r>
+      <w:r>
+        <w:t>) contains all of it.</w:t>
+      </w:r>
+    </w:p>
+    <w:p>
+      <w:pPr>
+        <w:spacing w:after="40"/>
+        <w:ind w:left="510" w:hanging="340"/>
+      </w:pPr>
+      <w:r>
+        <w:t xml:space="preserve">1. </w:t>
+      </w:r>
+      <w:r>
+        <w:rPr>
+          <w:b/>
+        </w:rPr>
+        <w:t>Why the emotion route has the worst Hamming loss</w:t>
+      </w:r>
+      <w:r>
+        <w:t xml:space="preserve"> (new paragraph in Appendix A.2). Hamming loss counts every wrong clip–genre decision equally, so for a rare genre the safest strategy is never to predict it. The emotion route predicts 2.35 genres per clip (truth 1.54, VGGish 1.85) and so makes more false alarms: Hamming loss 0.406 vs 0.358 for VGGish. Split by genre, it makes </w:t>
+      </w:r>
+      <w:r>
+        <w:rPr>
+          <w:i/>
+        </w:rPr>
+        <w:t>fewer</w:t>
+      </w:r>
+      <w:r>
+        <w:t xml:space="preserve"> errors than VGGish on Action and Drama and as many on Crime; the whole gap comes from Comedy and Horror, which it predicts for 148 and 135 of the 329 clips (40 and 28 are). The human ratings do the same (2.47 genres per clip, Hamming loss 0.427), so it is a property of the emotion features, not of prediction errors. Reproducible from </w:t>
+      </w:r>
+      <w:r>
+        <w:rPr>
+          <w:rFonts w:ascii="Consolas" w:hAnsi="Consolas"/>
+          <w:color w:val="404040"/>
+          <w:sz w:val="18"/>
+        </w:rPr>
+        <w:t>results/hamming_breakdown.json</w:t>
+      </w:r>
+      <w:r>
+        <w:t>. The paragraph before it was corrected: it said the always-"Drama" baseline wins every frequency-dominated metric, but it does not win weighted-F1.</w:t>
+      </w:r>
+    </w:p>
+    <w:p>
+      <w:pPr>
+        <w:spacing w:after="40"/>
+        <w:ind w:left="510" w:hanging="340"/>
+      </w:pPr>
+      <w:r>
+        <w:t xml:space="preserve">2. </w:t>
+      </w:r>
+      <w:r>
+        <w:rPr>
+          <w:b/>
+        </w:rPr>
+        <w:t>All ten figures checked.</w:t>
+      </w:r>
+      <w:r>
+        <w:t xml:space="preserve"> They regenerate identically from the results files and the Overleaf copies equal the repository's. Four were fixed: the in-domain figure's axis still said "41 films" (now 40) and two value labels covered clip-level markers; the axis labels of the zero-shot and ablation figures were cut off; the Stage 1 heatmap now writes "wav2vec 2.0" as the text does.</w:t>
+      </w:r>
+    </w:p>
+    <w:p>
+      <w:pPr>
+        <w:spacing w:after="40"/>
+        <w:ind w:left="510" w:hanging="340"/>
+      </w:pPr>
+      <w:r>
+        <w:t xml:space="preserve">3. </w:t>
+      </w:r>
+      <w:r>
+        <w:rPr>
+          <w:b/>
+        </w:rPr>
+        <w:t>Two stale film counts in the text</w:t>
+      </w:r>
+      <w:r>
+        <w:t>, missed in the re-run of 8 Oct: Methods (shared space: "319 clips from 41 films", now 40) and Discussion (reverse transfer: "41 test films", now 40). Chapter 5 now also says what the light-blue bars of the Blockbuster chart are (the 140 published MIR features, the 78 MFCC features among them, a random eight-dimensional projection).</w:t>
+      </w:r>
+    </w:p>
+    <w:p>
+      <w:pPr>
+        <w:spacing w:after="40"/>
+        <w:ind w:left="510" w:hanging="340"/>
+      </w:pPr>
+      <w:r>
+        <w:t xml:space="preserve">4. </w:t>
+      </w:r>
+      <w:r>
+        <w:rPr>
+          <w:b/>
+        </w:rPr>
+        <w:t>Documentation.</w:t>
+      </w:r>
+      <w:r>
+        <w:t xml:space="preserve"> Every evaluation metric, why it was chosen and what it showed, is explained in </w:t>
+      </w:r>
+      <w:r>
+        <w:rPr>
+          <w:rFonts w:ascii="Consolas" w:hAnsi="Consolas"/>
+          <w:color w:val="404040"/>
+          <w:sz w:val="18"/>
+        </w:rPr>
+        <w:t>docs/evaluation_metrics.md</w:t>
+      </w:r>
+      <w:r>
+        <w:t>. The repository's READMEs and the verification checklist were brought up to date with the post-fix numbers, and the consistency audit now flags any film count from before the fix.</w:t>
+      </w:r>
+    </w:p>
+    <w:p>
+      <w:pPr>
+        <w:pStyle w:val="Heading1"/>
+      </w:pPr>
+      <w:r>
         <w:t>8. Open items</w:t>
       </w:r>
     </w:p>
@@ -2672,7 +2799,7 @@
         <w:t>Read Chapters 5, 6 and Appendix A in full.</w:t>
       </w:r>
       <w:r>
-        <w:t xml:space="preserve"> They were rebuilt today; the Discussion's interpretation must become your own.</w:t>
+        <w:t xml:space="preserve"> They were rebuilt on 8 Oct; the Discussion's interpretation must become your own.</w:t>
       </w:r>
     </w:p>
     <w:p>
@@ -2690,7 +2817,7 @@
         <w:t>Zero-shot with a threshold tuned on the source dataset</w:t>
       </w:r>
       <w:r>
-        <w:t xml:space="preserve"> — still not run.</w:t>
+        <w:t xml:space="preserve"> — still not run (about 30 minutes); otherwise name it in Chapter 7 as future work.</w:t>
       </w:r>
     </w:p>
     <w:p>
@@ -2705,10 +2832,28 @@
         <w:rPr>
           <w:b/>
         </w:rPr>
+        <w:t>wav2vec 2.0 layer</w:t>
+      </w:r>
+      <w:r>
+        <w:t>: after the fix, block 1 is nominally best (0.297 vs 0.294 for the block 2 the thesis keeps). Decide whether that is acceptable.</w:t>
+      </w:r>
+    </w:p>
+    <w:p>
+      <w:pPr>
+        <w:spacing w:after="40"/>
+        <w:ind w:left="510" w:hanging="340"/>
+      </w:pPr>
+      <w:r>
+        <w:t xml:space="preserve">5. </w:t>
+      </w:r>
+      <w:r>
+        <w:rPr>
+          <w:b/>
+        </w:rPr>
         <w:t>AI declaration</w:t>
       </w:r>
       <w:r>
-        <w:t>: two red notes and the date.</w:t>
+        <w:t>: only the date is missing.</w:t>
       </w:r>
     </w:p>
     <w:p>
@@ -2761,6 +2906,17 @@
       </w:r>
       <w:r>
         <w:t xml:space="preserve"> A film was counted twice in Eerola; fixing it changed every split (section 2).</w:t>
+      </w:r>
+    </w:p>
+    <w:p>
+      <w:r>
+        <w:rPr>
+          <w:b/>
+        </w:rPr>
+        <w:t>Why does the emotion route score worst on Hamming loss?</w:t>
+      </w:r>
+      <w:r>
+        <w:t xml:space="preserve"> It predicts more genres per clip (2.35 against 1.54 true), which is how it finds the rare genres. Hamming loss counts every false alarm as an error, macro-F1 rewards every rare genre found. On Action and Drama it makes fewer errors than VGGish; the whole gap is Comedy and Horror. A model that always says "Drama" wins Hamming loss, which is why it is not the headline (section 7b; Appendix A.2).</w:t>
       </w:r>
     </w:p>
     <w:p>

</xml_diff>

<commit_message>
Author's comments of 16 Oct answered (review_2026-10-16.md) and applied on Overleaf; three research questions; chapter copies, log section 26, checklist, briefing synced
Co-Authored-By: Claude Opus 5.5 <noreply@anthropic.com>
</commit_message>
<xml_diff>
--- a/docs/current_state.docx
+++ b/docs/current_state.docx
@@ -18,7 +18,7 @@
         <w:t>Can a soundtrack's emotion predict a film's genre?</w:t>
       </w:r>
       <w:r>
-        <w:t xml:space="preserve"> This page covers what was done after the fifth meeting: the four notes, a data error found while answering the second one, and what both changed; section 7b adds the checks of 15–20 October. The briefing for the fourth meeting is archived in </w:t>
+        <w:t xml:space="preserve"> This page covers what was done after the fifth meeting: the four notes, a data error found while answering the second one, and what both changed; section 7b adds the work of 15–21 October. The briefing for the fourth meeting is archived in </w:t>
       </w:r>
       <w:r>
         <w:rPr>
@@ -2616,7 +2616,7 @@
         <w:pStyle w:val="Heading1"/>
       </w:pPr>
       <w:r>
-        <w:t>7b. Since then (15–20 October): one new analysis, a figure check, two corrections</w:t>
+        <w:t>7b. Since then (15–21 October): one new analysis, a figure check, your comments</w:t>
       </w:r>
     </w:p>
     <w:p>
@@ -2629,7 +2629,7 @@
           <w:color w:val="404040"/>
           <w:sz w:val="18"/>
         </w:rPr>
-        <w:t>4a77de0</w:t>
+        <w:t>497c6db</w:t>
       </w:r>
       <w:r>
         <w:t>) contains all of it.</w:t>
@@ -2716,6 +2716,44 @@
       </w:pPr>
       <w:r>
         <w:t xml:space="preserve">4. </w:t>
+      </w:r>
+      <w:r>
+        <w:rPr>
+          <w:b/>
+        </w:rPr>
+        <w:t>Your comments on the draft of 16 Oct</w:t>
+      </w:r>
+      <w:r>
+        <w:t xml:space="preserve"> (all 14 answered in </w:t>
+      </w:r>
+      <w:r>
+        <w:rPr>
+          <w:rFonts w:ascii="Consolas" w:hAnsi="Consolas"/>
+          <w:color w:val="404040"/>
+          <w:sz w:val="18"/>
+        </w:rPr>
+        <w:t>docs/review_2026-10-16.md</w:t>
+      </w:r>
+      <w:r>
+        <w:t xml:space="preserve">): plainer wording in the Introduction and a paragraph naming the datasets and the approach; in Fundamentals the leakage share corrected ("about half", not "roughly forty percent"), the rating ceiling explained, and Cohen's d and the corrected t-test given with their formulas. </w:t>
+      </w:r>
+      <w:r>
+        <w:rPr>
+          <w:b/>
+        </w:rPr>
+        <w:t>The research questions are now three</w:t>
+      </w:r>
+      <w:r>
+        <w:t>: RQ2a and RQ3 were merged into RQ2 (which emotions characterise each genre, and do these signatures hold on Blockbuster), and the old RQ2b is RQ3. The wording of the main research question is for the supervisor to comment on.</w:t>
+      </w:r>
+    </w:p>
+    <w:p>
+      <w:pPr>
+        <w:spacing w:after="40"/>
+        <w:ind w:left="510" w:hanging="340"/>
+      </w:pPr>
+      <w:r>
+        <w:t xml:space="preserve">5. </w:t>
       </w:r>
       <w:r>
         <w:rPr>

</xml_diff>

<commit_message>
Author's comments of 21 Oct: four how-questions (RQ3 comparison, RQ4 generalisation), pipeline instead of route in text and figures, per-genre precision/recall heatmaps, Horror diagnosis (exp_horror_diagnosis.py), Blockbuster chart reduced to the compared pipelines, abbreviations at first use
Co-Authored-By: Claude Opus 5.5 <noreply@anthropic.com>
</commit_message>
<xml_diff>
--- a/docs/current_state.docx
+++ b/docs/current_state.docx
@@ -18,7 +18,7 @@
         <w:t>Can a soundtrack's emotion predict a film's genre?</w:t>
       </w:r>
       <w:r>
-        <w:t xml:space="preserve"> This page covers what was done after the fifth meeting: the four notes, a data error found while answering the second one, and what both changed; section 7b adds the work of 15–21 October. The briefing for the fourth meeting is archived in </w:t>
+        <w:t xml:space="preserve"> This page covers what was done after the fifth meeting: the four notes, a data error found while answering the second one, and what both changed; section 7b adds the work of 15–27 October. The briefing for the fourth meeting is archived in </w:t>
       </w:r>
       <w:r>
         <w:rPr>
@@ -608,7 +608,7 @@
       <w:r>
         <w:drawing>
           <wp:inline xmlns:a="http://schemas.openxmlformats.org/drawingml/2006/main" xmlns:pic="http://schemas.openxmlformats.org/drawingml/2006/picture">
-            <wp:extent cx="5580000" cy="3059836"/>
+            <wp:extent cx="5580000" cy="2450564"/>
             <wp:docPr id="1" name="Picture 1"/>
             <wp:cNvGraphicFramePr>
               <a:graphicFrameLocks noChangeAspect="1"/>
@@ -629,7 +629,7 @@
                   <pic:spPr>
                     <a:xfrm>
                       <a:off x="0" y="0"/>
-                      <a:ext cx="5580000" cy="3059836"/>
+                      <a:ext cx="5580000" cy="2450564"/>
                     </a:xfrm>
                     <a:prstGeom prst="rect"/>
                   </pic:spPr>
@@ -1182,7 +1182,7 @@
       <w:r>
         <w:drawing>
           <wp:inline xmlns:a="http://schemas.openxmlformats.org/drawingml/2006/main" xmlns:pic="http://schemas.openxmlformats.org/drawingml/2006/picture">
-            <wp:extent cx="5580000" cy="2521642"/>
+            <wp:extent cx="5580000" cy="2502963"/>
             <wp:docPr id="3" name="Picture 3"/>
             <wp:cNvGraphicFramePr>
               <a:graphicFrameLocks noChangeAspect="1"/>
@@ -1203,7 +1203,7 @@
                   <pic:spPr>
                     <a:xfrm>
                       <a:off x="0" y="0"/>
-                      <a:ext cx="5580000" cy="2521642"/>
+                      <a:ext cx="5580000" cy="2502963"/>
                     </a:xfrm>
                     <a:prstGeom prst="rect"/>
                   </pic:spPr>
@@ -2616,12 +2616,12 @@
         <w:pStyle w:val="Heading1"/>
       </w:pPr>
       <w:r>
-        <w:t>7b. Since then (15–21 October): one new analysis, a figure check, your comments</w:t>
+        <w:t>7b. Since then (15–27 October): two new analyses, a figure check, your comments</w:t>
       </w:r>
     </w:p>
     <w:p>
       <w:r>
-        <w:t>No result changed. The thesis on Overleaf (</w:t>
+        <w:t>No headline result changed. The thesis on Overleaf (</w:t>
       </w:r>
       <w:r>
         <w:rPr>
@@ -2629,7 +2629,7 @@
           <w:color w:val="404040"/>
           <w:sz w:val="18"/>
         </w:rPr>
-        <w:t>497c6db</w:t>
+        <w:t>011fc8c</w:t>
       </w:r>
       <w:r>
         <w:t>) contains all of it.</w:t>
@@ -2754,6 +2754,53 @@
       </w:pPr>
       <w:r>
         <w:t xml:space="preserve">5. </w:t>
+      </w:r>
+      <w:r>
+        <w:rPr>
+          <w:b/>
+        </w:rPr>
+        <w:t>Your comments on the draft of 21 Oct</w:t>
+      </w:r>
+      <w:r>
+        <w:t xml:space="preserve"> (27 Oct; </w:t>
+      </w:r>
+      <w:r>
+        <w:rPr>
+          <w:rFonts w:ascii="Consolas" w:hAnsi="Consolas"/>
+          <w:color w:val="404040"/>
+          <w:sz w:val="18"/>
+        </w:rPr>
+        <w:t>docs/review_2026-10-16.md</w:t>
+      </w:r>
+      <w:r>
+        <w:t xml:space="preserve">, third part): the research questions are now </w:t>
+      </w:r>
+      <w:r>
+        <w:rPr>
+          <w:b/>
+        </w:rPr>
+        <w:t>four how-questions</w:t>
+      </w:r>
+      <w:r>
+        <w:t xml:space="preserve"> (RQ3 compares the two pipelines within one dataset, RQ4 asks how they generalise to the other); "route" is now "pipeline" throughout; Section 5.4 has a new precision/recall heatmap and explains </w:t>
+      </w:r>
+      <w:r>
+        <w:rPr>
+          <w:b/>
+        </w:rPr>
+        <w:t>why Horror is weak</w:t>
+      </w:r>
+      <w:r>
+        <w:t>: the emotion regression pulls the high fear of Horror clips towards the level of Action (predicted 3.73 vs 3.46, rated 4.35 vs 3.42), so with rated emotions Horror reaches F1 0.41 but with predicted ones only 0.23; the Blockbuster chart shows only the four compared pipelines, each defined; every abbreviation is spelled out at its first use.</w:t>
+      </w:r>
+    </w:p>
+    <w:p>
+      <w:pPr>
+        <w:spacing w:after="40"/>
+        <w:ind w:left="510" w:hanging="340"/>
+      </w:pPr>
+      <w:r>
+        <w:t xml:space="preserve">6. </w:t>
       </w:r>
       <w:r>
         <w:rPr>

</xml_diff>